<commit_message>
Psychological-factors tab: sync defaults from position, interactive Prospect Theory (before/after), Apply-to-position buttons. Rebuild Word workbook with real Spanish survey items + Nomade v2.0 three formal questions expanded with simulator tasks.
</commit_message>
<xml_diff>
--- a/Nomade_Vans_Case_Study_Simulator_Edition.docx
+++ b/Nomade_Vans_Case_Study_Simulator_Edition.docx
@@ -10,9 +10,9 @@
         <w:rPr>
           <w:b/>
           <w:color w:val="64748B"/>
-          <w:sz w:val="28"/>
+          <w:sz w:val="26"/>
         </w:rPr>
-        <w:t>CASE STUDY</w:t>
+        <w:t>CASO PRÁCTICO · CASE STUDY</w:t>
       </w:r>
     </w:p>
     <w:p>
@@ -38,7 +38,7 @@
           <w:color w:val="64748B"/>
           <w:sz w:val="24"/>
         </w:rPr>
-        <w:t>Interactive simulator edition — student workbook</w:t>
+        <w:t>Simulator-driven edition · v3.0 — student workbook</w:t>
       </w:r>
     </w:p>
     <w:p/>
@@ -50,14 +50,14 @@
         <w:rPr>
           <w:i/>
         </w:rPr>
-        <w:t>© César Moreno Pascual PhD — v1.0</w:t>
+        <w:t>© César Moreno Pascual PhD — based on Nomade v2.0 by Ariane Atucha, Ángela Pesquera, Irache Gallego, Paula García</w:t>
         <w:br/>
       </w:r>
       <w:r>
         <w:rPr>
           <w:i/>
         </w:rPr>
-        <w:t xml:space="preserve">Simulator: </w:t>
+        <w:t xml:space="preserve">Interactive simulator: </w:t>
       </w:r>
       <w:r>
         <w:rPr>
@@ -80,7 +80,7 @@
         <w:rPr>
           <w:color w:val="0F172A"/>
         </w:rPr>
-        <w:t>1. Case background</w:t>
+        <w:t>1. Caso · Case background</w:t>
       </w:r>
     </w:p>
     <w:p>
@@ -90,7 +90,17 @@
           <w:i w:val="0"/>
           <w:sz w:val="22"/>
         </w:rPr>
-        <w:t>Nomade Vans is a young Spanish start-up that rents converted camper vans to leisure travellers. After running a small fleet successfully for two seasons, the founders now want to formalise pricing for the coming year. Three direct competitors already operate in the same geographical market with published prices: Further VAN, People Camper and Ocean Vans.</w:t>
+        <w:t>Nomade Vans es una empresa española que se centra en el diseño y la «camperización» de furgonetas sostenibles. Permite a los consumidores personalizar el producto a través de su web y se ha planteado una nueva línea de negocio: el alquiler de camper vans.</w:t>
+      </w:r>
+    </w:p>
+    <w:p>
+      <w:r>
+        <w:rPr>
+          <w:b w:val="0"/>
+          <w:i/>
+          <w:sz w:val="20"/>
+        </w:rPr>
+        <w:t>Two service tiers are proposed: Standard Camper Rental and Premium Camper Rental (hybrid model, extra bed, indoor shower, air conditioning, solar power, extra kitchenware). Rentals are offered by day, weekend (2 nights) and week (6 nights). The combination gives a 2×3 price structure.</w:t>
       </w:r>
     </w:p>
     <w:p>
@@ -100,41 +110,7 @@
           <w:i w:val="0"/>
           <w:sz w:val="22"/>
         </w:rPr>
-        <w:t>The commercial team has three decisions to make for each rental period (day / 2-night weekend / 6-night week) and for each vehicle trim (Standard and Premium):</w:t>
-      </w:r>
-    </w:p>
-    <w:p>
-      <w:pPr>
-        <w:pStyle w:val="ListBullet"/>
-      </w:pPr>
-      <w:r>
-        <w:t>How much should we charge?</w:t>
-      </w:r>
-    </w:p>
-    <w:p>
-      <w:pPr>
-        <w:pStyle w:val="ListBullet"/>
-      </w:pPr>
-      <w:r>
-        <w:t>Where should we sit relative to the competition?</w:t>
-      </w:r>
-    </w:p>
-    <w:p>
-      <w:pPr>
-        <w:pStyle w:val="ListBullet"/>
-      </w:pPr>
-      <w:r>
-        <w:t>How should the number be presented (charm pricing, good-better-best…)?</w:t>
-      </w:r>
-    </w:p>
-    <w:p>
-      <w:r>
-        <w:rPr>
-          <w:b w:val="0"/>
-          <w:i w:val="0"/>
-          <w:sz w:val="22"/>
-        </w:rPr>
-        <w:t>Last spring we ran a quantitative survey with 90 respondents to measure willingness-to-pay (WTP). The survey data, together with a cost model, a competitor price sheet and the psychological-factors framework from the technical notes, are integrated into the interactive simulator you will use throughout this case.</w:t>
+        <w:t>A WTP survey was carried out with 95 respondents. Three competitors have been identified in the relevant market: Further VAN experience, People Camper and Ocean Vans. The simulator reproduces the WTP distribution, profit curves, competitor positioning and the main psychological factors from the technical notes.</w:t>
       </w:r>
     </w:p>
     <w:p>
@@ -145,19 +121,194 @@
         <w:rPr>
           <w:color w:val="0F172A"/>
         </w:rPr>
-        <w:t>2. The company — Nomade Vans</w:t>
+        <w:t>2. Estructura de precios óptimos sin segmentar (Nomade v2.0 · baseline)</w:t>
       </w:r>
     </w:p>
-    <w:p>
-      <w:r>
-        <w:rPr>
-          <w:b w:val="0"/>
-          <w:i w:val="0"/>
-          <w:sz w:val="22"/>
-        </w:rPr>
-        <w:t>Nomade Vans offers two trims: Standard (base conversion, proven kitchen + bed package) and Premium (solar roof, outdoor shower, expanded bed, premium upholstery). Each trim is rented at three usage tiers: a single day, a 2-night weekend and a 6-night week.</w:t>
-      </w:r>
-    </w:p>
+    <w:tbl>
+      <w:tblPr>
+        <w:tblStyle w:val="LightGrid-Accent1"/>
+        <w:tblW w:type="auto" w:w="0"/>
+        <w:tblLook w:firstColumn="1" w:firstRow="1" w:lastColumn="0" w:lastRow="0" w:noHBand="0" w:noVBand="1" w:val="04A0"/>
+      </w:tblPr>
+      <w:tblGrid>
+        <w:gridCol w:w="1728"/>
+        <w:gridCol w:w="1728"/>
+        <w:gridCol w:w="1728"/>
+        <w:gridCol w:w="1728"/>
+        <w:gridCol w:w="1728"/>
+      </w:tblGrid>
+      <w:tr>
+        <w:tc>
+          <w:tcPr>
+            <w:tcW w:type="dxa" w:w="1728"/>
+          </w:tcPr>
+          <w:p>
+            <w:r>
+              <w:rPr>
+                <w:b/>
+              </w:rPr>
+            </w:r>
+          </w:p>
+        </w:tc>
+        <w:tc>
+          <w:tcPr>
+            <w:tcW w:type="dxa" w:w="1728"/>
+          </w:tcPr>
+          <w:p>
+            <w:r>
+              <w:rPr>
+                <w:b/>
+              </w:rPr>
+              <w:t>Day</w:t>
+            </w:r>
+          </w:p>
+        </w:tc>
+        <w:tc>
+          <w:tcPr>
+            <w:tcW w:type="dxa" w:w="1728"/>
+          </w:tcPr>
+          <w:p>
+            <w:r>
+              <w:rPr>
+                <w:b/>
+              </w:rPr>
+              <w:t>Weekend</w:t>
+            </w:r>
+          </w:p>
+        </w:tc>
+        <w:tc>
+          <w:tcPr>
+            <w:tcW w:type="dxa" w:w="1728"/>
+          </w:tcPr>
+          <w:p>
+            <w:r>
+              <w:rPr>
+                <w:b/>
+              </w:rPr>
+              <w:t>Week</w:t>
+            </w:r>
+          </w:p>
+        </w:tc>
+        <w:tc>
+          <w:tcPr>
+            <w:tcW w:type="dxa" w:w="1728"/>
+          </w:tcPr>
+          <w:p>
+            <w:r>
+              <w:rPr>
+                <w:b/>
+              </w:rPr>
+              <w:t>Weekly (per day)</w:t>
+            </w:r>
+          </w:p>
+        </w:tc>
+      </w:tr>
+      <w:tr>
+        <w:tc>
+          <w:tcPr>
+            <w:tcW w:type="dxa" w:w="1728"/>
+          </w:tcPr>
+          <w:p>
+            <w:r>
+              <w:t>Standard</w:t>
+            </w:r>
+          </w:p>
+        </w:tc>
+        <w:tc>
+          <w:tcPr>
+            <w:tcW w:type="dxa" w:w="1728"/>
+          </w:tcPr>
+          <w:p>
+            <w:r>
+              <w:t>80 €</w:t>
+            </w:r>
+          </w:p>
+        </w:tc>
+        <w:tc>
+          <w:tcPr>
+            <w:tcW w:type="dxa" w:w="1728"/>
+          </w:tcPr>
+          <w:p>
+            <w:r>
+              <w:t>120 € / 60 €/day</w:t>
+            </w:r>
+          </w:p>
+        </w:tc>
+        <w:tc>
+          <w:tcPr>
+            <w:tcW w:type="dxa" w:w="1728"/>
+          </w:tcPr>
+          <w:p>
+            <w:r>
+              <w:t>420 €</w:t>
+            </w:r>
+          </w:p>
+        </w:tc>
+        <w:tc>
+          <w:tcPr>
+            <w:tcW w:type="dxa" w:w="1728"/>
+          </w:tcPr>
+          <w:p>
+            <w:r>
+              <w:t>60 €</w:t>
+            </w:r>
+          </w:p>
+        </w:tc>
+      </w:tr>
+      <w:tr>
+        <w:tc>
+          <w:tcPr>
+            <w:tcW w:type="dxa" w:w="1728"/>
+          </w:tcPr>
+          <w:p>
+            <w:r>
+              <w:t>Premium</w:t>
+            </w:r>
+          </w:p>
+        </w:tc>
+        <w:tc>
+          <w:tcPr>
+            <w:tcW w:type="dxa" w:w="1728"/>
+          </w:tcPr>
+          <w:p>
+            <w:r>
+              <w:t>100 €</w:t>
+            </w:r>
+          </w:p>
+        </w:tc>
+        <w:tc>
+          <w:tcPr>
+            <w:tcW w:type="dxa" w:w="1728"/>
+          </w:tcPr>
+          <w:p>
+            <w:r>
+              <w:t>160 € / 80 €/day</w:t>
+            </w:r>
+          </w:p>
+        </w:tc>
+        <w:tc>
+          <w:tcPr>
+            <w:tcW w:type="dxa" w:w="1728"/>
+          </w:tcPr>
+          <w:p>
+            <w:r>
+              <w:t>540 €</w:t>
+            </w:r>
+          </w:p>
+        </w:tc>
+        <w:tc>
+          <w:tcPr>
+            <w:tcW w:type="dxa" w:w="1728"/>
+          </w:tcPr>
+          <w:p>
+            <w:r>
+              <w:t>77 €</w:t>
+            </w:r>
+          </w:p>
+        </w:tc>
+      </w:tr>
+    </w:tbl>
+    <w:p/>
     <w:p>
       <w:pPr>
         <w:pStyle w:val="Heading1"/>
@@ -166,7 +317,7 @@
         <w:rPr>
           <w:color w:val="0F172A"/>
         </w:rPr>
-        <w:t>3. Cost structure</w:t>
+        <w:t>3. Estructura de costes · Cost structure</w:t>
       </w:r>
     </w:p>
     <w:tbl>
@@ -228,7 +379,7 @@
           </w:tcPr>
           <w:p>
             <w:r>
-              <w:t>Variable cost per rental (€)</w:t>
+              <w:t>Variable cost per rental (VC)</w:t>
             </w:r>
           </w:p>
         </w:tc>
@@ -238,7 +389,7 @@
           </w:tcPr>
           <w:p>
             <w:r>
-              <w:t>30</w:t>
+              <w:t>30 €</w:t>
             </w:r>
           </w:p>
         </w:tc>
@@ -248,7 +399,7 @@
           </w:tcPr>
           <w:p>
             <w:r>
-              <w:t>30</w:t>
+              <w:t>30 €</w:t>
             </w:r>
           </w:p>
         </w:tc>
@@ -260,7 +411,7 @@
           </w:tcPr>
           <w:p>
             <w:r>
-              <w:t>Fixed costs per year (€)</w:t>
+              <w:t>Fixed cost per year (CF)</w:t>
             </w:r>
           </w:p>
         </w:tc>
@@ -270,7 +421,7 @@
           </w:tcPr>
           <w:p>
             <w:r>
-              <w:t>69,750</w:t>
+              <w:t>69.750 €</w:t>
             </w:r>
           </w:p>
         </w:tc>
@@ -280,7 +431,7 @@
           </w:tcPr>
           <w:p>
             <w:r>
-              <w:t>77,750</w:t>
+              <w:t>77.750 €</w:t>
             </w:r>
           </w:p>
         </w:tc>
@@ -292,7 +443,7 @@
           </w:tcPr>
           <w:p>
             <w:r>
-              <w:t>Annual demand potential (D)</w:t>
+              <w:t>Demand potential (D)</w:t>
             </w:r>
           </w:p>
         </w:tc>
@@ -302,7 +453,7 @@
           </w:tcPr>
           <w:p>
             <w:r>
-              <w:t>5,000</w:t>
+              <w:t>5.000</w:t>
             </w:r>
           </w:p>
         </w:tc>
@@ -312,7 +463,7 @@
           </w:tcPr>
           <w:p>
             <w:r>
-              <w:t>5,000</w:t>
+              <w:t>5.000</w:t>
             </w:r>
           </w:p>
         </w:tc>
@@ -326,7 +477,7 @@
           <w:i/>
           <w:sz w:val="20"/>
         </w:rPr>
-        <w:t>Annual demand potential is scaled by period: ×1.0 for daily rentals, ×0.365 for weekends (≈ 182 weekend rentals per year), ×0.0743 for weekly rentals (≈ 52 per year).</w:t>
+        <w:t>Demand scaling: day × 1.0, weekend × 0.365 (≈ 182 rentals/year), week × 0.0743 (≈ 52 rentals/year).</w:t>
       </w:r>
     </w:p>
     <w:p>
@@ -337,7 +488,901 @@
         <w:rPr>
           <w:color w:val="0F172A"/>
         </w:rPr>
-        <w:t>4. Competitors — reference prices</w:t>
+        <w:t>4. Competidores (precios de referencia diario)</w:t>
+      </w:r>
+    </w:p>
+    <w:tbl>
+      <w:tblPr>
+        <w:tblStyle w:val="LightGrid-Accent1"/>
+        <w:tblW w:type="auto" w:w="0"/>
+        <w:tblLook w:firstColumn="1" w:firstRow="1" w:lastColumn="0" w:lastRow="0" w:noHBand="0" w:noVBand="1" w:val="04A0"/>
+      </w:tblPr>
+      <w:tblGrid>
+        <w:gridCol w:w="2880"/>
+        <w:gridCol w:w="2880"/>
+        <w:gridCol w:w="2880"/>
+      </w:tblGrid>
+      <w:tr>
+        <w:tc>
+          <w:tcPr>
+            <w:tcW w:type="dxa" w:w="2880"/>
+          </w:tcPr>
+          <w:p>
+            <w:r>
+              <w:rPr>
+                <w:b/>
+              </w:rPr>
+              <w:t>Competitor</w:t>
+            </w:r>
+          </w:p>
+        </w:tc>
+        <w:tc>
+          <w:tcPr>
+            <w:tcW w:type="dxa" w:w="2880"/>
+          </w:tcPr>
+          <w:p>
+            <w:r>
+              <w:rPr>
+                <w:b/>
+              </w:rPr>
+              <w:t>Standard (€)</w:t>
+            </w:r>
+          </w:p>
+        </w:tc>
+        <w:tc>
+          <w:tcPr>
+            <w:tcW w:type="dxa" w:w="2880"/>
+          </w:tcPr>
+          <w:p>
+            <w:r>
+              <w:rPr>
+                <w:b/>
+              </w:rPr>
+              <w:t>Premium (€)</w:t>
+            </w:r>
+          </w:p>
+        </w:tc>
+      </w:tr>
+      <w:tr>
+        <w:tc>
+          <w:tcPr>
+            <w:tcW w:type="dxa" w:w="2880"/>
+          </w:tcPr>
+          <w:p>
+            <w:r>
+              <w:t>Further VAN experience</w:t>
+            </w:r>
+          </w:p>
+        </w:tc>
+        <w:tc>
+          <w:tcPr>
+            <w:tcW w:type="dxa" w:w="2880"/>
+          </w:tcPr>
+          <w:p>
+            <w:r>
+              <w:t>85</w:t>
+            </w:r>
+          </w:p>
+        </w:tc>
+        <w:tc>
+          <w:tcPr>
+            <w:tcW w:type="dxa" w:w="2880"/>
+          </w:tcPr>
+          <w:p>
+            <w:r>
+              <w:t>95</w:t>
+            </w:r>
+          </w:p>
+        </w:tc>
+      </w:tr>
+      <w:tr>
+        <w:tc>
+          <w:tcPr>
+            <w:tcW w:type="dxa" w:w="2880"/>
+          </w:tcPr>
+          <w:p>
+            <w:r>
+              <w:t>People Camper</w:t>
+            </w:r>
+          </w:p>
+        </w:tc>
+        <w:tc>
+          <w:tcPr>
+            <w:tcW w:type="dxa" w:w="2880"/>
+          </w:tcPr>
+          <w:p>
+            <w:r>
+              <w:t>105</w:t>
+            </w:r>
+          </w:p>
+        </w:tc>
+        <w:tc>
+          <w:tcPr>
+            <w:tcW w:type="dxa" w:w="2880"/>
+          </w:tcPr>
+          <w:p>
+            <w:r>
+              <w:t>115</w:t>
+            </w:r>
+          </w:p>
+        </w:tc>
+      </w:tr>
+      <w:tr>
+        <w:tc>
+          <w:tcPr>
+            <w:tcW w:type="dxa" w:w="2880"/>
+          </w:tcPr>
+          <w:p>
+            <w:r>
+              <w:t>Ocean Vans</w:t>
+            </w:r>
+          </w:p>
+        </w:tc>
+        <w:tc>
+          <w:tcPr>
+            <w:tcW w:type="dxa" w:w="2880"/>
+          </w:tcPr>
+          <w:p>
+            <w:r>
+              <w:t>98</w:t>
+            </w:r>
+          </w:p>
+        </w:tc>
+        <w:tc>
+          <w:tcPr>
+            <w:tcW w:type="dxa" w:w="2880"/>
+          </w:tcPr>
+          <w:p>
+            <w:r>
+              <w:t>129</w:t>
+            </w:r>
+          </w:p>
+        </w:tc>
+      </w:tr>
+    </w:tbl>
+    <w:p/>
+    <w:p>
+      <w:r>
+        <w:rPr>
+          <w:b w:val="0"/>
+          <w:i/>
+          <w:sz w:val="20"/>
+        </w:rPr>
+        <w:t>All three competitors operate only by day. Weekend and weekly tariffs in the simulator are estimated (−5 % and −30 % respectively), as reference scenarios.</w:t>
+      </w:r>
+    </w:p>
+    <w:p>
+      <w:pPr>
+        <w:pStyle w:val="Heading1"/>
+      </w:pPr>
+      <w:r>
+        <w:rPr>
+          <w:color w:val="0F172A"/>
+        </w:rPr>
+        <w:t>5. Uso del simulador · How to use the simulator</w:t>
+      </w:r>
+    </w:p>
+    <w:p>
+      <w:r>
+        <w:rPr>
+          <w:b w:val="0"/>
+          <w:i w:val="0"/>
+          <w:sz w:val="22"/>
+        </w:rPr>
+        <w:t xml:space="preserve">URL: </w:t>
+      </w:r>
+      <w:r>
+        <w:rPr>
+          <w:color w:val="2563EB"/>
+          <w:u w:val="single"/>
+        </w:rPr>
+        <w:t>https://cmoreno34.github.io/nomade-pricing-simulator/</w:t>
+      </w:r>
+    </w:p>
+    <w:p>
+      <w:pPr>
+        <w:pStyle w:val="ListNumber"/>
+      </w:pPr>
+      <w:r>
+        <w:t>Select period (Daily / Weekend / Week) and version (Standard / Premium) at the top. Everything updates.</w:t>
+      </w:r>
+    </w:p>
+    <w:p>
+      <w:pPr>
+        <w:pStyle w:val="ListNumber"/>
+      </w:pPr>
+      <w:r>
+        <w:t>On Competition-based → Profit curve, DRAG the green "Our price" line. Coloured dashed lines are competitors. KPIs (profit, demand, revenue, lost-vs-peak) update live. Use Match-competitor / Snap-to-peak buttons for quick moves.</w:t>
+      </w:r>
+    </w:p>
+    <w:p>
+      <w:pPr>
+        <w:pStyle w:val="ListNumber"/>
+      </w:pPr>
+      <w:r>
+        <w:t>On Psychological factors, all inputs are pre-loaded from your current position. Experiment with Anchoring (good-better-best), Charm pricing (€80 vs €79), Prospect Theory (before/after price, perceived pain/gain) and Reference price (cheapest competitor by default). Use Apply-to-position buttons to push a tested number back into Position &amp; prices.</w:t>
+      </w:r>
+    </w:p>
+    <w:p>
+      <w:pPr>
+        <w:pStyle w:val="ListNumber"/>
+      </w:pPr>
+      <w:r>
+        <w:t>On Position &amp; prices you see the same interactive chart and full numeric inputs for every period. Add the analyst note.</w:t>
+      </w:r>
+    </w:p>
+    <w:p>
+      <w:pPr>
+        <w:pStyle w:val="ListNumber"/>
+      </w:pPr>
+      <w:r>
+        <w:t>On Download Excel, one click produces a .xlsx with 7 sheets: Guide, Questions, Answers (Day / Weekend / Week), Position and Charts (all 9 charts embedded as images).</w:t>
+      </w:r>
+    </w:p>
+    <w:p>
+      <w:r>
+        <w:br w:type="page"/>
+      </w:r>
+    </w:p>
+    <w:p>
+      <w:pPr>
+        <w:pStyle w:val="Heading1"/>
+      </w:pPr>
+      <w:r>
+        <w:rPr>
+          <w:color w:val="0F172A"/>
+        </w:rPr>
+        <w:t>6. La encuesta · The 13 survey questions</w:t>
+      </w:r>
+    </w:p>
+    <w:p>
+      <w:r>
+        <w:rPr>
+          <w:b w:val="0"/>
+          <w:i/>
+          <w:sz w:val="22"/>
+        </w:rPr>
+        <w:t>Before interpreting the aggregated data, answer the 13 questions as if you were one of the 95 respondents. Items 1–7 build the buyer profile; items 8–13 are the WTP measurements. Phrasing is the original Spanish from the questionnaire, with English translation below.</w:t>
+      </w:r>
+    </w:p>
+    <w:p>
+      <w:r>
+        <w:rPr>
+          <w:b/>
+        </w:rPr>
+        <w:t xml:space="preserve">Q1. </w:t>
+      </w:r>
+      <w:r>
+        <w:t>Por favor, indique su género.</w:t>
+      </w:r>
+    </w:p>
+    <w:p>
+      <w:r>
+        <w:rPr>
+          <w:i/>
+          <w:color w:val="64748B"/>
+        </w:rPr>
+        <w:t>(Please indicate your gender.)</w:t>
+      </w:r>
+    </w:p>
+    <w:tbl>
+      <w:tblPr>
+        <w:tblW w:type="auto" w:w="0"/>
+        <w:tblLayout w:type="autofit"/>
+        <w:tblLook w:firstColumn="1" w:firstRow="1" w:lastColumn="0" w:lastRow="0" w:noHBand="0" w:noVBand="1" w:val="04A0"/>
+      </w:tblPr>
+      <w:tblGrid>
+        <w:gridCol w:w="8640"/>
+      </w:tblGrid>
+      <w:tr>
+        <w:tc>
+          <w:tcPr>
+            <w:tcW w:type="dxa" w:w="8640"/>
+            <w:shd w:fill="F8FAFC"/>
+          </w:tcPr>
+          <w:p>
+            <w:r>
+              <w:br/>
+            </w:r>
+          </w:p>
+        </w:tc>
+      </w:tr>
+    </w:tbl>
+    <w:p/>
+    <w:p>
+      <w:r>
+        <w:rPr>
+          <w:b/>
+        </w:rPr>
+        <w:t xml:space="preserve">Q2. </w:t>
+      </w:r>
+      <w:r>
+        <w:t>¿En qué rango de edad se encuentra?  &lt;20 / 20-30 / 30-40 / 40-50 / 50-60 / &gt;60</w:t>
+      </w:r>
+    </w:p>
+    <w:p>
+      <w:r>
+        <w:rPr>
+          <w:i/>
+          <w:color w:val="64748B"/>
+        </w:rPr>
+        <w:t>(What age range are you in?)</w:t>
+      </w:r>
+    </w:p>
+    <w:tbl>
+      <w:tblPr>
+        <w:tblW w:type="auto" w:w="0"/>
+        <w:tblLayout w:type="autofit"/>
+        <w:tblLook w:firstColumn="1" w:firstRow="1" w:lastColumn="0" w:lastRow="0" w:noHBand="0" w:noVBand="1" w:val="04A0"/>
+      </w:tblPr>
+      <w:tblGrid>
+        <w:gridCol w:w="8640"/>
+      </w:tblGrid>
+      <w:tr>
+        <w:tc>
+          <w:tcPr>
+            <w:tcW w:type="dxa" w:w="8640"/>
+            <w:shd w:fill="F8FAFC"/>
+          </w:tcPr>
+          <w:p>
+            <w:r>
+              <w:br/>
+            </w:r>
+          </w:p>
+        </w:tc>
+      </w:tr>
+    </w:tbl>
+    <w:p/>
+    <w:p>
+      <w:r>
+        <w:rPr>
+          <w:b/>
+        </w:rPr>
+        <w:t xml:space="preserve">Q3. </w:t>
+      </w:r>
+      <w:r>
+        <w:t>¿Cuál es su estado civil?  Soltero / Casado / Divorciado / Viudo</w:t>
+      </w:r>
+    </w:p>
+    <w:p>
+      <w:r>
+        <w:rPr>
+          <w:i/>
+          <w:color w:val="64748B"/>
+        </w:rPr>
+        <w:t>(What is your civil status?)</w:t>
+      </w:r>
+    </w:p>
+    <w:tbl>
+      <w:tblPr>
+        <w:tblW w:type="auto" w:w="0"/>
+        <w:tblLayout w:type="autofit"/>
+        <w:tblLook w:firstColumn="1" w:firstRow="1" w:lastColumn="0" w:lastRow="0" w:noHBand="0" w:noVBand="1" w:val="04A0"/>
+      </w:tblPr>
+      <w:tblGrid>
+        <w:gridCol w:w="8640"/>
+      </w:tblGrid>
+      <w:tr>
+        <w:tc>
+          <w:tcPr>
+            <w:tcW w:type="dxa" w:w="8640"/>
+            <w:shd w:fill="F8FAFC"/>
+          </w:tcPr>
+          <w:p>
+            <w:r>
+              <w:br/>
+            </w:r>
+          </w:p>
+        </w:tc>
+      </w:tr>
+    </w:tbl>
+    <w:p/>
+    <w:p>
+      <w:r>
+        <w:rPr>
+          <w:b/>
+        </w:rPr>
+        <w:t xml:space="preserve">Q4. </w:t>
+      </w:r>
+      <w:r>
+        <w:t>¿Cuál es su nivel de educación?  Primaria / Secundaria / Grado Universitario / Máster o Posgrado</w:t>
+      </w:r>
+    </w:p>
+    <w:p>
+      <w:r>
+        <w:rPr>
+          <w:i/>
+          <w:color w:val="64748B"/>
+        </w:rPr>
+        <w:t>(What is your level of education?)</w:t>
+      </w:r>
+    </w:p>
+    <w:tbl>
+      <w:tblPr>
+        <w:tblW w:type="auto" w:w="0"/>
+        <w:tblLayout w:type="autofit"/>
+        <w:tblLook w:firstColumn="1" w:firstRow="1" w:lastColumn="0" w:lastRow="0" w:noHBand="0" w:noVBand="1" w:val="04A0"/>
+      </w:tblPr>
+      <w:tblGrid>
+        <w:gridCol w:w="8640"/>
+      </w:tblGrid>
+      <w:tr>
+        <w:tc>
+          <w:tcPr>
+            <w:tcW w:type="dxa" w:w="8640"/>
+            <w:shd w:fill="F8FAFC"/>
+          </w:tcPr>
+          <w:p>
+            <w:r>
+              <w:br/>
+            </w:r>
+          </w:p>
+        </w:tc>
+      </w:tr>
+    </w:tbl>
+    <w:p/>
+    <w:p>
+      <w:r>
+        <w:rPr>
+          <w:b/>
+        </w:rPr>
+        <w:t xml:space="preserve">Q5. </w:t>
+      </w:r>
+      <w:r>
+        <w:t>Seleccione su situación laboral.  Empleado / Autónomo / Desempleado / Jubilado / Estudiante</w:t>
+      </w:r>
+    </w:p>
+    <w:p>
+      <w:r>
+        <w:rPr>
+          <w:i/>
+          <w:color w:val="64748B"/>
+        </w:rPr>
+        <w:t>(Select your employment status.)</w:t>
+      </w:r>
+    </w:p>
+    <w:tbl>
+      <w:tblPr>
+        <w:tblW w:type="auto" w:w="0"/>
+        <w:tblLayout w:type="autofit"/>
+        <w:tblLook w:firstColumn="1" w:firstRow="1" w:lastColumn="0" w:lastRow="0" w:noHBand="0" w:noVBand="1" w:val="04A0"/>
+      </w:tblPr>
+      <w:tblGrid>
+        <w:gridCol w:w="8640"/>
+      </w:tblGrid>
+      <w:tr>
+        <w:tc>
+          <w:tcPr>
+            <w:tcW w:type="dxa" w:w="8640"/>
+            <w:shd w:fill="F8FAFC"/>
+          </w:tcPr>
+          <w:p>
+            <w:r>
+              <w:br/>
+            </w:r>
+          </w:p>
+        </w:tc>
+      </w:tr>
+    </w:tbl>
+    <w:p/>
+    <w:p>
+      <w:r>
+        <w:rPr>
+          <w:b/>
+        </w:rPr>
+        <w:t xml:space="preserve">Q6. </w:t>
+      </w:r>
+      <w:r>
+        <w:t>¿Qué le gusta hacer en su tiempo libre? (Puede marcar más de una respuesta)  Viajar · Leer · Practicar algún deporte · Realizar actividades de aventura · Pasar tiempo en familia · Otras</w:t>
+      </w:r>
+    </w:p>
+    <w:p>
+      <w:r>
+        <w:rPr>
+          <w:i/>
+          <w:color w:val="64748B"/>
+        </w:rPr>
+        <w:t>(What do you like to do in your free time? Multiple answers allowed.)</w:t>
+      </w:r>
+    </w:p>
+    <w:tbl>
+      <w:tblPr>
+        <w:tblW w:type="auto" w:w="0"/>
+        <w:tblLayout w:type="autofit"/>
+        <w:tblLook w:firstColumn="1" w:firstRow="1" w:lastColumn="0" w:lastRow="0" w:noHBand="0" w:noVBand="1" w:val="04A0"/>
+      </w:tblPr>
+      <w:tblGrid>
+        <w:gridCol w:w="8640"/>
+      </w:tblGrid>
+      <w:tr>
+        <w:tc>
+          <w:tcPr>
+            <w:tcW w:type="dxa" w:w="8640"/>
+            <w:shd w:fill="F8FAFC"/>
+          </w:tcPr>
+          <w:p>
+            <w:r>
+              <w:br/>
+            </w:r>
+          </w:p>
+        </w:tc>
+      </w:tr>
+    </w:tbl>
+    <w:p/>
+    <w:p>
+      <w:r>
+        <w:rPr>
+          <w:b/>
+        </w:rPr>
+        <w:t xml:space="preserve">Q7. </w:t>
+      </w:r>
+      <w:r>
+        <w:t>¿Cuántos días sueles irte de vacaciones?  Menos de 3 días / Entre 3 y 5 días / Entre 5 y 7 días / Más de una semana</w:t>
+      </w:r>
+    </w:p>
+    <w:p>
+      <w:r>
+        <w:rPr>
+          <w:i/>
+          <w:color w:val="64748B"/>
+        </w:rPr>
+        <w:t>(How many days do you usually go on vacation?)</w:t>
+      </w:r>
+    </w:p>
+    <w:tbl>
+      <w:tblPr>
+        <w:tblW w:type="auto" w:w="0"/>
+        <w:tblLayout w:type="autofit"/>
+        <w:tblLook w:firstColumn="1" w:firstRow="1" w:lastColumn="0" w:lastRow="0" w:noHBand="0" w:noVBand="1" w:val="04A0"/>
+      </w:tblPr>
+      <w:tblGrid>
+        <w:gridCol w:w="8640"/>
+      </w:tblGrid>
+      <w:tr>
+        <w:tc>
+          <w:tcPr>
+            <w:tcW w:type="dxa" w:w="8640"/>
+            <w:shd w:fill="F8FAFC"/>
+          </w:tcPr>
+          <w:p>
+            <w:r>
+              <w:br/>
+            </w:r>
+          </w:p>
+        </w:tc>
+      </w:tr>
+    </w:tbl>
+    <w:p/>
+    <w:p>
+      <w:r>
+        <w:rPr>
+          <w:b/>
+        </w:rPr>
+        <w:t xml:space="preserve">Q8. </w:t>
+      </w:r>
+      <w:r>
+        <w:t>¿Cuál es el precio máximo que estás dispuesto a pagar por el alquiler de una camper ESTÁNDAR al día?  (50 / 60 / 70 / 80 / 90 / 100 / 110 / 120 / 130 €)</w:t>
+      </w:r>
+    </w:p>
+    <w:p>
+      <w:r>
+        <w:rPr>
+          <w:i/>
+          <w:color w:val="64748B"/>
+        </w:rPr>
+        <w:t>(Max price per day — Standard.)</w:t>
+      </w:r>
+    </w:p>
+    <w:tbl>
+      <w:tblPr>
+        <w:tblW w:type="auto" w:w="0"/>
+        <w:tblLayout w:type="autofit"/>
+        <w:tblLook w:firstColumn="1" w:firstRow="1" w:lastColumn="0" w:lastRow="0" w:noHBand="0" w:noVBand="1" w:val="04A0"/>
+      </w:tblPr>
+      <w:tblGrid>
+        <w:gridCol w:w="8640"/>
+      </w:tblGrid>
+      <w:tr>
+        <w:tc>
+          <w:tcPr>
+            <w:tcW w:type="dxa" w:w="8640"/>
+            <w:shd w:fill="F8FAFC"/>
+          </w:tcPr>
+          <w:p>
+            <w:r>
+              <w:br/>
+            </w:r>
+          </w:p>
+        </w:tc>
+      </w:tr>
+    </w:tbl>
+    <w:p/>
+    <w:p>
+      <w:r>
+        <w:rPr>
+          <w:b/>
+        </w:rPr>
+        <w:t xml:space="preserve">Q9. </w:t>
+      </w:r>
+      <w:r>
+        <w:t>¿Cuál es el precio máximo que estás dispuesto a pagar por el alquiler de una camper ESTÁNDAR durante un fin de semana (2 noches)?</w:t>
+      </w:r>
+    </w:p>
+    <w:p>
+      <w:r>
+        <w:rPr>
+          <w:i/>
+          <w:color w:val="64748B"/>
+        </w:rPr>
+        <w:t>(Max price per weekend — 2 nights — Standard.)</w:t>
+      </w:r>
+    </w:p>
+    <w:tbl>
+      <w:tblPr>
+        <w:tblW w:type="auto" w:w="0"/>
+        <w:tblLayout w:type="autofit"/>
+        <w:tblLook w:firstColumn="1" w:firstRow="1" w:lastColumn="0" w:lastRow="0" w:noHBand="0" w:noVBand="1" w:val="04A0"/>
+      </w:tblPr>
+      <w:tblGrid>
+        <w:gridCol w:w="8640"/>
+      </w:tblGrid>
+      <w:tr>
+        <w:tc>
+          <w:tcPr>
+            <w:tcW w:type="dxa" w:w="8640"/>
+            <w:shd w:fill="F8FAFC"/>
+          </w:tcPr>
+          <w:p>
+            <w:r>
+              <w:br/>
+            </w:r>
+          </w:p>
+        </w:tc>
+      </w:tr>
+    </w:tbl>
+    <w:p/>
+    <w:p>
+      <w:r>
+        <w:rPr>
+          <w:b/>
+        </w:rPr>
+        <w:t xml:space="preserve">Q10. </w:t>
+      </w:r>
+      <w:r>
+        <w:t>¿Cuál es el precio máximo que estás dispuesto a pagar por el alquiler de una camper ESTÁNDAR durante una semana (6 noches)?</w:t>
+      </w:r>
+    </w:p>
+    <w:p>
+      <w:r>
+        <w:rPr>
+          <w:i/>
+          <w:color w:val="64748B"/>
+        </w:rPr>
+        <w:t>(Max price per week — 6 nights — Standard.)</w:t>
+      </w:r>
+    </w:p>
+    <w:tbl>
+      <w:tblPr>
+        <w:tblW w:type="auto" w:w="0"/>
+        <w:tblLayout w:type="autofit"/>
+        <w:tblLook w:firstColumn="1" w:firstRow="1" w:lastColumn="0" w:lastRow="0" w:noHBand="0" w:noVBand="1" w:val="04A0"/>
+      </w:tblPr>
+      <w:tblGrid>
+        <w:gridCol w:w="8640"/>
+      </w:tblGrid>
+      <w:tr>
+        <w:tc>
+          <w:tcPr>
+            <w:tcW w:type="dxa" w:w="8640"/>
+            <w:shd w:fill="F8FAFC"/>
+          </w:tcPr>
+          <w:p>
+            <w:r>
+              <w:br/>
+            </w:r>
+          </w:p>
+        </w:tc>
+      </w:tr>
+    </w:tbl>
+    <w:p/>
+    <w:p>
+      <w:r>
+        <w:rPr>
+          <w:b/>
+        </w:rPr>
+        <w:t xml:space="preserve">Q11. </w:t>
+      </w:r>
+      <w:r>
+        <w:t>¿Cuál es el precio máximo que estás dispuesto a pagar por el alquiler de la camper PREMIUM al día?</w:t>
+      </w:r>
+    </w:p>
+    <w:p>
+      <w:r>
+        <w:rPr>
+          <w:i/>
+          <w:color w:val="64748B"/>
+        </w:rPr>
+        <w:t>(Max price per day — Premium.)</w:t>
+      </w:r>
+    </w:p>
+    <w:tbl>
+      <w:tblPr>
+        <w:tblW w:type="auto" w:w="0"/>
+        <w:tblLayout w:type="autofit"/>
+        <w:tblLook w:firstColumn="1" w:firstRow="1" w:lastColumn="0" w:lastRow="0" w:noHBand="0" w:noVBand="1" w:val="04A0"/>
+      </w:tblPr>
+      <w:tblGrid>
+        <w:gridCol w:w="8640"/>
+      </w:tblGrid>
+      <w:tr>
+        <w:tc>
+          <w:tcPr>
+            <w:tcW w:type="dxa" w:w="8640"/>
+            <w:shd w:fill="F8FAFC"/>
+          </w:tcPr>
+          <w:p>
+            <w:r>
+              <w:br/>
+            </w:r>
+          </w:p>
+        </w:tc>
+      </w:tr>
+    </w:tbl>
+    <w:p/>
+    <w:p>
+      <w:r>
+        <w:rPr>
+          <w:b/>
+        </w:rPr>
+        <w:t xml:space="preserve">Q12. </w:t>
+      </w:r>
+      <w:r>
+        <w:t>¿Cuál es el precio máximo que estás dispuesto a pagar por el alquiler de una camper PREMIUM durante un fin de semana (2 noches)?</w:t>
+      </w:r>
+    </w:p>
+    <w:p>
+      <w:r>
+        <w:rPr>
+          <w:i/>
+          <w:color w:val="64748B"/>
+        </w:rPr>
+        <w:t>(Max price per weekend — 2 nights — Premium.)</w:t>
+      </w:r>
+    </w:p>
+    <w:tbl>
+      <w:tblPr>
+        <w:tblW w:type="auto" w:w="0"/>
+        <w:tblLayout w:type="autofit"/>
+        <w:tblLook w:firstColumn="1" w:firstRow="1" w:lastColumn="0" w:lastRow="0" w:noHBand="0" w:noVBand="1" w:val="04A0"/>
+      </w:tblPr>
+      <w:tblGrid>
+        <w:gridCol w:w="8640"/>
+      </w:tblGrid>
+      <w:tr>
+        <w:tc>
+          <w:tcPr>
+            <w:tcW w:type="dxa" w:w="8640"/>
+            <w:shd w:fill="F8FAFC"/>
+          </w:tcPr>
+          <w:p>
+            <w:r>
+              <w:br/>
+            </w:r>
+          </w:p>
+        </w:tc>
+      </w:tr>
+    </w:tbl>
+    <w:p/>
+    <w:p>
+      <w:r>
+        <w:rPr>
+          <w:b/>
+        </w:rPr>
+        <w:t xml:space="preserve">Q13. </w:t>
+      </w:r>
+      <w:r>
+        <w:t>¿Cuál es el precio máximo que estás dispuesto a pagar por el alquiler de una camper PREMIUM durante una semana (6 noches)?</w:t>
+      </w:r>
+    </w:p>
+    <w:p>
+      <w:r>
+        <w:rPr>
+          <w:i/>
+          <w:color w:val="64748B"/>
+        </w:rPr>
+        <w:t>(Max price per week — 6 nights — Premium.)</w:t>
+      </w:r>
+    </w:p>
+    <w:tbl>
+      <w:tblPr>
+        <w:tblW w:type="auto" w:w="0"/>
+        <w:tblLayout w:type="autofit"/>
+        <w:tblLook w:firstColumn="1" w:firstRow="1" w:lastColumn="0" w:lastRow="0" w:noHBand="0" w:noVBand="1" w:val="04A0"/>
+      </w:tblPr>
+      <w:tblGrid>
+        <w:gridCol w:w="8640"/>
+      </w:tblGrid>
+      <w:tr>
+        <w:tc>
+          <w:tcPr>
+            <w:tcW w:type="dxa" w:w="8640"/>
+            <w:shd w:fill="F8FAFC"/>
+          </w:tcPr>
+          <w:p>
+            <w:r>
+              <w:br/>
+            </w:r>
+          </w:p>
+        </w:tc>
+      </w:tr>
+    </w:tbl>
+    <w:p/>
+    <w:p>
+      <w:r>
+        <w:br w:type="page"/>
+      </w:r>
+    </w:p>
+    <w:p>
+      <w:pPr>
+        <w:pStyle w:val="Heading1"/>
+      </w:pPr>
+      <w:r>
+        <w:rPr>
+          <w:color w:val="0F172A"/>
+        </w:rPr>
+        <w:t>7. Preguntas del caso · Formal deliverable questions</w:t>
+      </w:r>
+    </w:p>
+    <w:p>
+      <w:r>
+        <w:rPr>
+          <w:b w:val="0"/>
+          <w:i/>
+          <w:sz w:val="22"/>
+        </w:rPr>
+        <w:t>The three questions below reproduce the original Nomade v2.0 deliverables. Each one is expanded with concrete simulator tasks so you can ground your answer in evidence from the interactive tool.</w:t>
+      </w:r>
+    </w:p>
+    <w:p>
+      <w:r>
+        <w:rPr>
+          <w:b/>
+          <w:color w:val="F97316"/>
+        </w:rPr>
+        <w:t xml:space="preserve">P1. </w:t>
+      </w:r>
+      <w:r>
+        <w:rPr>
+          <w:b/>
+        </w:rPr>
+        <w:t>Indicar las suposiciones sobre las estructuras de costes de los competidores y la diferenciación del valor de marca en comparación con NOMADE. Tenga en cuenta que NOMADE es nuevo y que los demás están bien establecidos.</w:t>
+      </w:r>
+    </w:p>
+    <w:p>
+      <w:r>
+        <w:rPr>
+          <w:i/>
+          <w:color w:val="64748B"/>
+        </w:rPr>
+        <w:t>(State your assumptions about the competitors' cost structures and the differentiation of Nomade's brand value versus the established rivals.)</w:t>
+      </w:r>
+    </w:p>
+    <w:p>
+      <w:r>
+        <w:rPr>
+          <w:b/>
+          <w:i w:val="0"/>
+          <w:sz w:val="22"/>
+        </w:rPr>
+        <w:t>Tareas con el simulador · Tasks with the simulator:</w:t>
+      </w:r>
+    </w:p>
+    <w:p>
+      <w:pPr>
+        <w:pStyle w:val="ListBullet"/>
+      </w:pPr>
+      <w:r>
+        <w:t>In Competition-based → Profit curve, read the profit we would earn at each competitor's price (dashed lines). Fill the table below.</w:t>
       </w:r>
     </w:p>
     <w:tbl>
@@ -375,7 +1420,7 @@
               <w:rPr>
                 <w:b/>
               </w:rPr>
-              <w:t>Daily Std / Prem (€)</w:t>
+              <w:t>Their Std (€)</w:t>
             </w:r>
           </w:p>
         </w:tc>
@@ -388,7 +1433,7 @@
               <w:rPr>
                 <w:b/>
               </w:rPr>
-              <w:t>Weekend Std / Prem (€)</w:t>
+              <w:t>Our profit at their price (€)</w:t>
             </w:r>
           </w:p>
         </w:tc>
@@ -401,7 +1446,7 @@
               <w:rPr>
                 <w:b/>
               </w:rPr>
-              <w:t>Weekly Std / Prem (€)</w:t>
+              <w:t>Likely their FC (assumption)</w:t>
             </w:r>
           </w:p>
         </w:tc>
@@ -413,7 +1458,7 @@
           </w:tcPr>
           <w:p>
             <w:r>
-              <w:t>Further VAN</w:t>
+              <w:t>Further VAN experience</w:t>
             </w:r>
           </w:p>
         </w:tc>
@@ -421,31 +1466,19 @@
           <w:tcPr>
             <w:tcW w:type="dxa" w:w="2160"/>
           </w:tcPr>
-          <w:p>
-            <w:r>
-              <w:t>85 / 95</w:t>
-            </w:r>
-          </w:p>
+          <w:p/>
         </w:tc>
         <w:tc>
           <w:tcPr>
             <w:tcW w:type="dxa" w:w="2160"/>
           </w:tcPr>
-          <w:p>
-            <w:r>
-              <w:t>80 / 90</w:t>
-            </w:r>
-          </w:p>
+          <w:p/>
         </w:tc>
         <w:tc>
           <w:tcPr>
             <w:tcW w:type="dxa" w:w="2160"/>
           </w:tcPr>
-          <w:p>
-            <w:r>
-              <w:t>60 / 70</w:t>
-            </w:r>
-          </w:p>
+          <w:p/>
         </w:tc>
       </w:tr>
       <w:tr>
@@ -463,31 +1496,19 @@
           <w:tcPr>
             <w:tcW w:type="dxa" w:w="2160"/>
           </w:tcPr>
-          <w:p>
-            <w:r>
-              <w:t>105 / 115</w:t>
-            </w:r>
-          </w:p>
+          <w:p/>
         </w:tc>
         <w:tc>
           <w:tcPr>
             <w:tcW w:type="dxa" w:w="2160"/>
           </w:tcPr>
-          <w:p>
-            <w:r>
-              <w:t>100 / 110</w:t>
-            </w:r>
-          </w:p>
+          <w:p/>
         </w:tc>
         <w:tc>
           <w:tcPr>
             <w:tcW w:type="dxa" w:w="2160"/>
           </w:tcPr>
-          <w:p>
-            <w:r>
-              <w:t>75 / 85</w:t>
-            </w:r>
-          </w:p>
+          <w:p/>
         </w:tc>
       </w:tr>
       <w:tr>
@@ -505,96 +1526,37 @@
           <w:tcPr>
             <w:tcW w:type="dxa" w:w="2160"/>
           </w:tcPr>
-          <w:p>
-            <w:r>
-              <w:t>98 / 129</w:t>
-            </w:r>
-          </w:p>
+          <w:p/>
         </w:tc>
         <w:tc>
           <w:tcPr>
             <w:tcW w:type="dxa" w:w="2160"/>
           </w:tcPr>
-          <w:p>
-            <w:r>
-              <w:t>93 / 123</w:t>
-            </w:r>
-          </w:p>
+          <w:p/>
         </w:tc>
         <w:tc>
           <w:tcPr>
             <w:tcW w:type="dxa" w:w="2160"/>
           </w:tcPr>
-          <w:p>
-            <w:r>
-              <w:t>68 / 95</w:t>
-            </w:r>
-          </w:p>
+          <w:p/>
         </w:tc>
       </w:tr>
     </w:tbl>
     <w:p/>
     <w:p>
+      <w:pPr>
+        <w:pStyle w:val="ListBullet"/>
+      </w:pPr>
       <w:r>
-        <w:rPr>
-          <w:b w:val="0"/>
-          <w:i/>
-          <w:sz w:val="20"/>
-        </w:rPr>
-        <w:t>These prices are the defaults preloaded in the simulator; you can change them on the Position &amp; prices tab if you have fresher intelligence.</w:t>
+        <w:t>Justify why NOMADE's FC could be higher (new, smaller scale, fewer vehicles to amortise fixed costs) and what brand-value elements (design, sustainability, customisation) could compensate.</w:t>
       </w:r>
     </w:p>
     <w:p>
       <w:pPr>
-        <w:pStyle w:val="Heading1"/>
+        <w:pStyle w:val="ListBullet"/>
       </w:pPr>
       <w:r>
-        <w:rPr>
-          <w:color w:val="0F172A"/>
-        </w:rPr>
-        <w:t>5. The WTP survey</w:t>
-      </w:r>
-    </w:p>
-    <w:p>
-      <w:r>
-        <w:rPr>
-          <w:b w:val="0"/>
-          <w:i w:val="0"/>
-          <w:sz w:val="22"/>
-        </w:rPr>
-        <w:t>We asked 90 Spanish residents (aged 20–60, representative of the target segment of leisure travellers) about their demographic profile and about the maximum price they would be willing to pay for a Nomade Vans camper, in six different usage scenarios. The simulator uses the aggregated price-frequency table as the basis of its demand curve.</w:t>
-      </w:r>
-    </w:p>
-    <w:p>
-      <w:pPr>
-        <w:pStyle w:val="Heading1"/>
-      </w:pPr>
-      <w:r>
-        <w:rPr>
-          <w:color w:val="0F172A"/>
-        </w:rPr>
-        <w:t>6. The 13 survey questions — please answer them yourself</w:t>
-      </w:r>
-    </w:p>
-    <w:p>
-      <w:r>
-        <w:rPr>
-          <w:b w:val="0"/>
-          <w:i/>
-          <w:sz w:val="22"/>
-        </w:rPr>
-        <w:t>Before you analyse the aggregated data, answer the 13 questions as if you were one of the 90 respondents. This exercise builds empathy with the customer and helps you detect possible biases in the aggregated data.</w:t>
-      </w:r>
-    </w:p>
-    <w:p>
-      <w:r>
-        <w:rPr>
-          <w:b/>
-        </w:rPr>
-        <w:t xml:space="preserve">Q1. </w:t>
-      </w:r>
-      <w:r>
-        <w:t>Gender (Male / Female / Other):</w:t>
+        <w:t>Conclude with one-line assumptions per competitor (cost structure + brand-value gap).</w:t>
       </w:r>
     </w:p>
     <w:tbl>
@@ -614,10 +1576,14 @@
           </w:tcPr>
           <w:p>
             <w:r>
-              <w:rPr>
-                <w:i/>
-                <w:color w:val="64748B"/>
-              </w:rPr>
+              <w:br/>
+              <w:br/>
+              <w:br/>
+              <w:br/>
+              <w:br/>
+              <w:br/>
+              <w:br/>
+              <w:br/>
               <w:br/>
             </w:r>
           </w:p>
@@ -629,11 +1595,90 @@
       <w:r>
         <w:rPr>
           <w:b/>
+          <w:color w:val="F97316"/>
         </w:rPr>
-        <w:t xml:space="preserve">Q2. </w:t>
+        <w:t xml:space="preserve">P2. </w:t>
       </w:r>
       <w:r>
-        <w:t>Age range (&lt;20, 20–30, 30–40, 40–50, &gt;50):</w:t>
+        <w:rPr>
+          <w:b/>
+        </w:rPr>
+        <w:t>Sugerir una estrategia competitiva para Nomade, indicando si es posible mejorar su posición en el mercado con una visión estratégica, y considerar también algunos posibles factores psicológicos.</w:t>
+      </w:r>
+    </w:p>
+    <w:p>
+      <w:r>
+        <w:rPr>
+          <w:i/>
+          <w:color w:val="64748B"/>
+        </w:rPr>
+        <w:t>(Recommend a competitive strategy — strategic positioning + psychological factors.)</w:t>
+      </w:r>
+    </w:p>
+    <w:p>
+      <w:r>
+        <w:rPr>
+          <w:b/>
+          <w:i w:val="0"/>
+          <w:sz w:val="22"/>
+        </w:rPr>
+        <w:t>Tareas con el simulador · Tasks with the simulator:</w:t>
+      </w:r>
+    </w:p>
+    <w:p>
+      <w:pPr>
+        <w:pStyle w:val="ListBullet"/>
+      </w:pPr>
+      <w:r>
+        <w:t>Use the Profit curve drag-handle to propose a Standard price that beats our current peak while remaining below People Camper. Screenshot it.</w:t>
+      </w:r>
+    </w:p>
+    <w:p>
+      <w:pPr>
+        <w:pStyle w:val="ListBullet"/>
+      </w:pPr>
+      <w:r>
+        <w:t>Open Psychological factors. Reset all controls from position. Experiment in this order:</w:t>
+      </w:r>
+    </w:p>
+    <w:p>
+      <w:pPr>
+        <w:pStyle w:val="ListNumber"/>
+      </w:pPr>
+      <w:r>
+        <w:t>Anchoring: design a Good-Better-Best sandwich. What middle price do you recommend? Apply it to Our Standard.</w:t>
+      </w:r>
+    </w:p>
+    <w:p>
+      <w:pPr>
+        <w:pStyle w:val="ListNumber"/>
+      </w:pPr>
+      <w:r>
+        <w:t>Charm pricing: test round vs charm. Does the +7 % perception uplift beat the margin cost of −€1? Apply if it does.</w:t>
+      </w:r>
+    </w:p>
+    <w:p>
+      <w:pPr>
+        <w:pStyle w:val="ListNumber"/>
+      </w:pPr>
+      <w:r>
+        <w:t>Prospect Theory: if you raise price by €10 next year, quantify the perceived pain. Draft a one-sentence framing to reduce it.</w:t>
+      </w:r>
+    </w:p>
+    <w:p>
+      <w:pPr>
+        <w:pStyle w:val="ListNumber"/>
+      </w:pPr>
+      <w:r>
+        <w:t>Reference price: set the cheapest competitor as reference. What share of respondents sit above? Does this support or weaken your Standard price?</w:t>
+      </w:r>
+    </w:p>
+    <w:p>
+      <w:pPr>
+        <w:pStyle w:val="ListBullet"/>
+      </w:pPr>
+      <w:r>
+        <w:t>Finish with a &lt;100-word positioning statement: where does Nomade sit, why, and what is the psychological hook.</w:t>
       </w:r>
     </w:p>
     <w:tbl>
@@ -653,10 +1698,18 @@
           </w:tcPr>
           <w:p>
             <w:r>
-              <w:rPr>
-                <w:i/>
-                <w:color w:val="64748B"/>
-              </w:rPr>
+              <w:br/>
+              <w:br/>
+              <w:br/>
+              <w:br/>
+              <w:br/>
+              <w:br/>
+              <w:br/>
+              <w:br/>
+              <w:br/>
+              <w:br/>
+              <w:br/>
+              <w:br/>
               <w:br/>
             </w:r>
           </w:p>
@@ -668,11 +1721,193 @@
       <w:r>
         <w:rPr>
           <w:b/>
+          <w:color w:val="F97316"/>
         </w:rPr>
-        <w:t xml:space="preserve">Q3. </w:t>
+        <w:t xml:space="preserve">P3. </w:t>
       </w:r>
       <w:r>
-        <w:t>Civil status (Single / Married / Divorced / Widowed):</w:t>
+        <w:rPr>
+          <w:b/>
+        </w:rPr>
+        <w:t>Sugerir una estrategia de implementación de precios con los precios de lista finales y elaborar algunas posibles acciones promocionales.</w:t>
+      </w:r>
+    </w:p>
+    <w:p>
+      <w:r>
+        <w:rPr>
+          <w:i/>
+          <w:color w:val="64748B"/>
+        </w:rPr>
+        <w:t>(Final list prices and promotional actions.)</w:t>
+      </w:r>
+    </w:p>
+    <w:p>
+      <w:r>
+        <w:rPr>
+          <w:b/>
+          <w:i w:val="0"/>
+          <w:sz w:val="22"/>
+        </w:rPr>
+        <w:t>Tareas con el simulador · Tasks with the simulator:</w:t>
+      </w:r>
+    </w:p>
+    <w:p>
+      <w:pPr>
+        <w:pStyle w:val="ListBullet"/>
+      </w:pPr>
+      <w:r>
+        <w:t>For each combination (period × version) set the final price in Position &amp; prices. Fill the table:</w:t>
+      </w:r>
+    </w:p>
+    <w:tbl>
+      <w:tblPr>
+        <w:tblStyle w:val="LightGrid-Accent1"/>
+        <w:tblW w:type="auto" w:w="0"/>
+        <w:tblLook w:firstColumn="1" w:firstRow="1" w:lastColumn="0" w:lastRow="0" w:noHBand="0" w:noVBand="1" w:val="04A0"/>
+      </w:tblPr>
+      <w:tblGrid>
+        <w:gridCol w:w="2160"/>
+        <w:gridCol w:w="2160"/>
+        <w:gridCol w:w="2160"/>
+        <w:gridCol w:w="2160"/>
+      </w:tblGrid>
+      <w:tr>
+        <w:tc>
+          <w:tcPr>
+            <w:tcW w:type="dxa" w:w="2160"/>
+          </w:tcPr>
+          <w:p>
+            <w:r>
+              <w:rPr>
+                <w:b/>
+              </w:rPr>
+            </w:r>
+          </w:p>
+        </w:tc>
+        <w:tc>
+          <w:tcPr>
+            <w:tcW w:type="dxa" w:w="2160"/>
+          </w:tcPr>
+          <w:p>
+            <w:r>
+              <w:rPr>
+                <w:b/>
+              </w:rPr>
+              <w:t>Day</w:t>
+            </w:r>
+          </w:p>
+        </w:tc>
+        <w:tc>
+          <w:tcPr>
+            <w:tcW w:type="dxa" w:w="2160"/>
+          </w:tcPr>
+          <w:p>
+            <w:r>
+              <w:rPr>
+                <w:b/>
+              </w:rPr>
+              <w:t>Weekend (per day)</w:t>
+            </w:r>
+          </w:p>
+        </w:tc>
+        <w:tc>
+          <w:tcPr>
+            <w:tcW w:type="dxa" w:w="2160"/>
+          </w:tcPr>
+          <w:p>
+            <w:r>
+              <w:rPr>
+                <w:b/>
+              </w:rPr>
+              <w:t>Week (per day)</w:t>
+            </w:r>
+          </w:p>
+        </w:tc>
+      </w:tr>
+      <w:tr>
+        <w:tc>
+          <w:tcPr>
+            <w:tcW w:type="dxa" w:w="2160"/>
+          </w:tcPr>
+          <w:p>
+            <w:r>
+              <w:t>Standard</w:t>
+            </w:r>
+          </w:p>
+        </w:tc>
+        <w:tc>
+          <w:tcPr>
+            <w:tcW w:type="dxa" w:w="2160"/>
+          </w:tcPr>
+          <w:p/>
+        </w:tc>
+        <w:tc>
+          <w:tcPr>
+            <w:tcW w:type="dxa" w:w="2160"/>
+          </w:tcPr>
+          <w:p/>
+        </w:tc>
+        <w:tc>
+          <w:tcPr>
+            <w:tcW w:type="dxa" w:w="2160"/>
+          </w:tcPr>
+          <w:p/>
+        </w:tc>
+      </w:tr>
+      <w:tr>
+        <w:tc>
+          <w:tcPr>
+            <w:tcW w:type="dxa" w:w="2160"/>
+          </w:tcPr>
+          <w:p>
+            <w:r>
+              <w:t>Premium</w:t>
+            </w:r>
+          </w:p>
+        </w:tc>
+        <w:tc>
+          <w:tcPr>
+            <w:tcW w:type="dxa" w:w="2160"/>
+          </w:tcPr>
+          <w:p/>
+        </w:tc>
+        <w:tc>
+          <w:tcPr>
+            <w:tcW w:type="dxa" w:w="2160"/>
+          </w:tcPr>
+          <w:p/>
+        </w:tc>
+        <w:tc>
+          <w:tcPr>
+            <w:tcW w:type="dxa" w:w="2160"/>
+          </w:tcPr>
+          <w:p/>
+        </w:tc>
+      </w:tr>
+    </w:tbl>
+    <w:p/>
+    <w:p>
+      <w:pPr>
+        <w:pStyle w:val="ListBullet"/>
+      </w:pPr>
+      <w:r>
+        <w:t>Justify each number in one bullet, referring explicitly to: the peak, the WTP acceptance %, the nearest competitor and a psychological lever.</w:t>
+      </w:r>
+    </w:p>
+    <w:p>
+      <w:pPr>
+        <w:pStyle w:val="ListBullet"/>
+      </w:pPr>
+      <w:r>
+        <w:t>Draft 2–3 promotional actions compatible with your strategy (e.g., early-bird weekend, loyalty week-at-day-price, charm endings, good-better-best bundle). For each action, specify: target segment, price lever, expected pain / gain according to Prospect Theory.</w:t>
+      </w:r>
+    </w:p>
+    <w:p>
+      <w:pPr>
+        <w:pStyle w:val="ListBullet"/>
+      </w:pPr>
+      <w:r>
+        <w:t>Add the analyst note inside the simulator, click Download Excel, and attach the file to your submission.</w:t>
       </w:r>
     </w:p>
     <w:tbl>
@@ -692,400 +1927,18 @@
           </w:tcPr>
           <w:p>
             <w:r>
-              <w:rPr>
-                <w:i/>
-                <w:color w:val="64748B"/>
-              </w:rPr>
               <w:br/>
-            </w:r>
-          </w:p>
-        </w:tc>
-      </w:tr>
-    </w:tbl>
-    <w:p/>
-    <w:p>
-      <w:r>
-        <w:rPr>
-          <w:b/>
-        </w:rPr>
-        <w:t xml:space="preserve">Q4. </w:t>
-      </w:r>
-      <w:r>
-        <w:t>Education level (Primary / Secondary / University / Master or PhD):</w:t>
-      </w:r>
-    </w:p>
-    <w:tbl>
-      <w:tblPr>
-        <w:tblW w:type="auto" w:w="0"/>
-        <w:tblLayout w:type="autofit"/>
-        <w:tblLook w:firstColumn="1" w:firstRow="1" w:lastColumn="0" w:lastRow="0" w:noHBand="0" w:noVBand="1" w:val="04A0"/>
-      </w:tblPr>
-      <w:tblGrid>
-        <w:gridCol w:w="8640"/>
-      </w:tblGrid>
-      <w:tr>
-        <w:tc>
-          <w:tcPr>
-            <w:tcW w:type="dxa" w:w="8640"/>
-            <w:shd w:fill="F8FAFC"/>
-          </w:tcPr>
-          <w:p>
-            <w:r>
-              <w:rPr>
-                <w:i/>
-                <w:color w:val="64748B"/>
-              </w:rPr>
               <w:br/>
-            </w:r>
-          </w:p>
-        </w:tc>
-      </w:tr>
-    </w:tbl>
-    <w:p/>
-    <w:p>
-      <w:r>
-        <w:rPr>
-          <w:b/>
-        </w:rPr>
-        <w:t xml:space="preserve">Q5. </w:t>
-      </w:r>
-      <w:r>
-        <w:t>Employment status (Employed / Self-employed / Unemployed / Retired / Student):</w:t>
-      </w:r>
-    </w:p>
-    <w:tbl>
-      <w:tblPr>
-        <w:tblW w:type="auto" w:w="0"/>
-        <w:tblLayout w:type="autofit"/>
-        <w:tblLook w:firstColumn="1" w:firstRow="1" w:lastColumn="0" w:lastRow="0" w:noHBand="0" w:noVBand="1" w:val="04A0"/>
-      </w:tblPr>
-      <w:tblGrid>
-        <w:gridCol w:w="8640"/>
-      </w:tblGrid>
-      <w:tr>
-        <w:tc>
-          <w:tcPr>
-            <w:tcW w:type="dxa" w:w="8640"/>
-            <w:shd w:fill="F8FAFC"/>
-          </w:tcPr>
-          <w:p>
-            <w:r>
-              <w:rPr>
-                <w:i/>
-                <w:color w:val="64748B"/>
-              </w:rPr>
               <w:br/>
-            </w:r>
-          </w:p>
-        </w:tc>
-      </w:tr>
-    </w:tbl>
-    <w:p/>
-    <w:p>
-      <w:r>
-        <w:rPr>
-          <w:b/>
-        </w:rPr>
-        <w:t xml:space="preserve">Q6. </w:t>
-      </w:r>
-      <w:r>
-        <w:t>Leisure activities you enjoy (mark all that apply: Travel, Read, Sports, Adventure, Family time, Other):</w:t>
-      </w:r>
-    </w:p>
-    <w:tbl>
-      <w:tblPr>
-        <w:tblW w:type="auto" w:w="0"/>
-        <w:tblLayout w:type="autofit"/>
-        <w:tblLook w:firstColumn="1" w:firstRow="1" w:lastColumn="0" w:lastRow="0" w:noHBand="0" w:noVBand="1" w:val="04A0"/>
-      </w:tblPr>
-      <w:tblGrid>
-        <w:gridCol w:w="8640"/>
-      </w:tblGrid>
-      <w:tr>
-        <w:tc>
-          <w:tcPr>
-            <w:tcW w:type="dxa" w:w="8640"/>
-            <w:shd w:fill="F8FAFC"/>
-          </w:tcPr>
-          <w:p>
-            <w:r>
-              <w:rPr>
-                <w:i/>
-                <w:color w:val="64748B"/>
-              </w:rPr>
               <w:br/>
-            </w:r>
-          </w:p>
-        </w:tc>
-      </w:tr>
-    </w:tbl>
-    <w:p/>
-    <w:p>
-      <w:r>
-        <w:rPr>
-          <w:b/>
-        </w:rPr>
-        <w:t xml:space="preserve">Q7. </w:t>
-      </w:r>
-      <w:r>
-        <w:t>Days of vacation per year (&lt;3, 3–5, 5–7, &gt;7):</w:t>
-      </w:r>
-    </w:p>
-    <w:tbl>
-      <w:tblPr>
-        <w:tblW w:type="auto" w:w="0"/>
-        <w:tblLayout w:type="autofit"/>
-        <w:tblLook w:firstColumn="1" w:firstRow="1" w:lastColumn="0" w:lastRow="0" w:noHBand="0" w:noVBand="1" w:val="04A0"/>
-      </w:tblPr>
-      <w:tblGrid>
-        <w:gridCol w:w="8640"/>
-      </w:tblGrid>
-      <w:tr>
-        <w:tc>
-          <w:tcPr>
-            <w:tcW w:type="dxa" w:w="8640"/>
-            <w:shd w:fill="F8FAFC"/>
-          </w:tcPr>
-          <w:p>
-            <w:r>
-              <w:rPr>
-                <w:i/>
-                <w:color w:val="64748B"/>
-              </w:rPr>
               <w:br/>
-            </w:r>
-          </w:p>
-        </w:tc>
-      </w:tr>
-    </w:tbl>
-    <w:p/>
-    <w:p>
-      <w:r>
-        <w:rPr>
-          <w:b/>
-        </w:rPr>
-        <w:t xml:space="preserve">Q8. </w:t>
-      </w:r>
-      <w:r>
-        <w:t>Maximum price you would pay for a Standard Nomade Vans / day (€):</w:t>
-      </w:r>
-    </w:p>
-    <w:tbl>
-      <w:tblPr>
-        <w:tblW w:type="auto" w:w="0"/>
-        <w:tblLayout w:type="autofit"/>
-        <w:tblLook w:firstColumn="1" w:firstRow="1" w:lastColumn="0" w:lastRow="0" w:noHBand="0" w:noVBand="1" w:val="04A0"/>
-      </w:tblPr>
-      <w:tblGrid>
-        <w:gridCol w:w="8640"/>
-      </w:tblGrid>
-      <w:tr>
-        <w:tc>
-          <w:tcPr>
-            <w:tcW w:type="dxa" w:w="8640"/>
-            <w:shd w:fill="F8FAFC"/>
-          </w:tcPr>
-          <w:p>
-            <w:r>
-              <w:rPr>
-                <w:i/>
-                <w:color w:val="64748B"/>
-              </w:rPr>
               <w:br/>
-            </w:r>
-          </w:p>
-        </w:tc>
-      </w:tr>
-    </w:tbl>
-    <w:p/>
-    <w:p>
-      <w:r>
-        <w:rPr>
-          <w:b/>
-        </w:rPr>
-        <w:t xml:space="preserve">Q9. </w:t>
-      </w:r>
-      <w:r>
-        <w:t>Maximum price you would pay for a Standard Nomade Vans / weekend — 2 nights (€):</w:t>
-      </w:r>
-    </w:p>
-    <w:tbl>
-      <w:tblPr>
-        <w:tblW w:type="auto" w:w="0"/>
-        <w:tblLayout w:type="autofit"/>
-        <w:tblLook w:firstColumn="1" w:firstRow="1" w:lastColumn="0" w:lastRow="0" w:noHBand="0" w:noVBand="1" w:val="04A0"/>
-      </w:tblPr>
-      <w:tblGrid>
-        <w:gridCol w:w="8640"/>
-      </w:tblGrid>
-      <w:tr>
-        <w:tc>
-          <w:tcPr>
-            <w:tcW w:type="dxa" w:w="8640"/>
-            <w:shd w:fill="F8FAFC"/>
-          </w:tcPr>
-          <w:p>
-            <w:r>
-              <w:rPr>
-                <w:i/>
-                <w:color w:val="64748B"/>
-              </w:rPr>
               <w:br/>
-            </w:r>
-          </w:p>
-        </w:tc>
-      </w:tr>
-    </w:tbl>
-    <w:p/>
-    <w:p>
-      <w:r>
-        <w:rPr>
-          <w:b/>
-        </w:rPr>
-        <w:t xml:space="preserve">Q10. </w:t>
-      </w:r>
-      <w:r>
-        <w:t>Maximum price you would pay for a Standard Nomade Vans / week — 6 nights (€):</w:t>
-      </w:r>
-    </w:p>
-    <w:tbl>
-      <w:tblPr>
-        <w:tblW w:type="auto" w:w="0"/>
-        <w:tblLayout w:type="autofit"/>
-        <w:tblLook w:firstColumn="1" w:firstRow="1" w:lastColumn="0" w:lastRow="0" w:noHBand="0" w:noVBand="1" w:val="04A0"/>
-      </w:tblPr>
-      <w:tblGrid>
-        <w:gridCol w:w="8640"/>
-      </w:tblGrid>
-      <w:tr>
-        <w:tc>
-          <w:tcPr>
-            <w:tcW w:type="dxa" w:w="8640"/>
-            <w:shd w:fill="F8FAFC"/>
-          </w:tcPr>
-          <w:p>
-            <w:r>
-              <w:rPr>
-                <w:i/>
-                <w:color w:val="64748B"/>
-              </w:rPr>
               <w:br/>
-            </w:r>
-          </w:p>
-        </w:tc>
-      </w:tr>
-    </w:tbl>
-    <w:p/>
-    <w:p>
-      <w:r>
-        <w:rPr>
-          <w:b/>
-        </w:rPr>
-        <w:t xml:space="preserve">Q11. </w:t>
-      </w:r>
-      <w:r>
-        <w:t>Maximum price you would pay for a Premium Nomade Vans / day (€):</w:t>
-      </w:r>
-    </w:p>
-    <w:tbl>
-      <w:tblPr>
-        <w:tblW w:type="auto" w:w="0"/>
-        <w:tblLayout w:type="autofit"/>
-        <w:tblLook w:firstColumn="1" w:firstRow="1" w:lastColumn="0" w:lastRow="0" w:noHBand="0" w:noVBand="1" w:val="04A0"/>
-      </w:tblPr>
-      <w:tblGrid>
-        <w:gridCol w:w="8640"/>
-      </w:tblGrid>
-      <w:tr>
-        <w:tc>
-          <w:tcPr>
-            <w:tcW w:type="dxa" w:w="8640"/>
-            <w:shd w:fill="F8FAFC"/>
-          </w:tcPr>
-          <w:p>
-            <w:r>
-              <w:rPr>
-                <w:i/>
-                <w:color w:val="64748B"/>
-              </w:rPr>
               <w:br/>
-            </w:r>
-          </w:p>
-        </w:tc>
-      </w:tr>
-    </w:tbl>
-    <w:p/>
-    <w:p>
-      <w:r>
-        <w:rPr>
-          <w:b/>
-        </w:rPr>
-        <w:t xml:space="preserve">Q12. </w:t>
-      </w:r>
-      <w:r>
-        <w:t>Maximum price you would pay for a Premium Nomade Vans / weekend — 2 nights (€):</w:t>
-      </w:r>
-    </w:p>
-    <w:tbl>
-      <w:tblPr>
-        <w:tblW w:type="auto" w:w="0"/>
-        <w:tblLayout w:type="autofit"/>
-        <w:tblLook w:firstColumn="1" w:firstRow="1" w:lastColumn="0" w:lastRow="0" w:noHBand="0" w:noVBand="1" w:val="04A0"/>
-      </w:tblPr>
-      <w:tblGrid>
-        <w:gridCol w:w="8640"/>
-      </w:tblGrid>
-      <w:tr>
-        <w:tc>
-          <w:tcPr>
-            <w:tcW w:type="dxa" w:w="8640"/>
-            <w:shd w:fill="F8FAFC"/>
-          </w:tcPr>
-          <w:p>
-            <w:r>
-              <w:rPr>
-                <w:i/>
-                <w:color w:val="64748B"/>
-              </w:rPr>
               <w:br/>
-            </w:r>
-          </w:p>
-        </w:tc>
-      </w:tr>
-    </w:tbl>
-    <w:p/>
-    <w:p>
-      <w:r>
-        <w:rPr>
-          <w:b/>
-        </w:rPr>
-        <w:t xml:space="preserve">Q13. </w:t>
-      </w:r>
-      <w:r>
-        <w:t>Maximum price you would pay for a Premium Nomade Vans / week — 6 nights (€):</w:t>
-      </w:r>
-    </w:p>
-    <w:tbl>
-      <w:tblPr>
-        <w:tblW w:type="auto" w:w="0"/>
-        <w:tblLayout w:type="autofit"/>
-        <w:tblLook w:firstColumn="1" w:firstRow="1" w:lastColumn="0" w:lastRow="0" w:noHBand="0" w:noVBand="1" w:val="04A0"/>
-      </w:tblPr>
-      <w:tblGrid>
-        <w:gridCol w:w="8640"/>
-      </w:tblGrid>
-      <w:tr>
-        <w:tc>
-          <w:tcPr>
-            <w:tcW w:type="dxa" w:w="8640"/>
-            <w:shd w:fill="F8FAFC"/>
-          </w:tcPr>
-          <w:p>
-            <w:r>
-              <w:rPr>
-                <w:i/>
-                <w:color w:val="64748B"/>
-              </w:rPr>
+              <w:br/>
+              <w:br/>
               <w:br/>
             </w:r>
           </w:p>
@@ -1106,34 +1959,50 @@
         <w:rPr>
           <w:color w:val="0F172A"/>
         </w:rPr>
-        <w:t>7. Using the interactive simulator</w:t>
+        <w:t>8. Criterios de evaluación · Evaluation criteria</w:t>
       </w:r>
     </w:p>
     <w:p>
+      <w:pPr>
+        <w:pStyle w:val="ListBullet"/>
+      </w:pPr>
       <w:r>
-        <w:rPr>
-          <w:b w:val="0"/>
-          <w:i w:val="0"/>
-          <w:sz w:val="22"/>
-        </w:rPr>
-        <w:t xml:space="preserve">Open: </w:t>
-      </w:r>
-      <w:r>
-        <w:rPr>
-          <w:color w:val="2563EB"/>
-          <w:u w:val="single"/>
-        </w:rPr>
-        <w:t>https://cmoreno34.github.io/nomade-pricing-simulator/</w:t>
+        <w:t>Rigor (simulator evidence: screenshots, Excel, numbers).</w:t>
       </w:r>
     </w:p>
     <w:p>
+      <w:pPr>
+        <w:pStyle w:val="ListBullet"/>
+      </w:pPr>
+      <w:r>
+        <w:t>Integration of competition + WTP + psychological factors into a coherent story.</w:t>
+      </w:r>
+    </w:p>
+    <w:p>
+      <w:pPr>
+        <w:pStyle w:val="ListBullet"/>
+      </w:pPr>
+      <w:r>
+        <w:t>Clarity &amp; brevity — numbers justified, trade-offs explicit.</w:t>
+      </w:r>
+    </w:p>
+    <w:p>
+      <w:pPr>
+        <w:pStyle w:val="ListBullet"/>
+      </w:pPr>
+      <w:r>
+        <w:t>Attached Excel export with final prices, position snapshot and chart images.</w:t>
+      </w:r>
+    </w:p>
+    <w:p>
+      <w:pPr>
+        <w:pStyle w:val="Heading2"/>
+      </w:pPr>
       <w:r>
         <w:rPr>
-          <w:b/>
-          <w:i w:val="0"/>
-          <w:sz w:val="22"/>
+          <w:color w:val="0F172A"/>
         </w:rPr>
-        <w:t>Five-step walkthrough:</w:t>
+        <w:t>Entregables · Deliverables</w:t>
       </w:r>
     </w:p>
     <w:p>
@@ -1141,7 +2010,7 @@
         <w:pStyle w:val="ListNumber"/>
       </w:pPr>
       <w:r>
-        <w:t>Pick a rental period (Daily / Weekend / Week) and a version (Standard or Premium) at the top.</w:t>
+        <w:t>This workbook (Word), every answer box filled in.</w:t>
       </w:r>
     </w:p>
     <w:p>
@@ -1149,7 +2018,7 @@
         <w:pStyle w:val="ListNumber"/>
       </w:pPr>
       <w:r>
-        <w:t>Go to Competition-based. On the Profit curve, drag the green "Our price" line — KPIs for profit, demand, revenue and lost-vs-peak update live. The three coloured dashed lines are Further VAN, People Camper and Ocean Vans, so you can read at each competitor's x what our profit would be at their price.</w:t>
+        <w:t>The Excel file (.xlsx) downloaded from the simulator with your final position.</w:t>
       </w:r>
     </w:p>
     <w:p>
@@ -1157,516 +2026,7 @@
         <w:pStyle w:val="ListNumber"/>
       </w:pPr>
       <w:r>
-        <w:t>Go to Psychological factors. Try a three-tier menu (anchoring), a charm-pricing test (€80 vs €79), the Prospect-Theory value function, and a reference-price split.</w:t>
-      </w:r>
-    </w:p>
-    <w:p>
-      <w:pPr>
-        <w:pStyle w:val="ListNumber"/>
-      </w:pPr>
-      <w:r>
-        <w:t>Open Position &amp; prices. Drag on the chart or type the numeric price. Add a free-text analyst note.</w:t>
-      </w:r>
-    </w:p>
-    <w:p>
-      <w:pPr>
-        <w:pStyle w:val="ListNumber"/>
-      </w:pPr>
-      <w:r>
-        <w:t>Open Download Excel. One click produces a .xlsx with the 13 questions, aggregated answers, your position and all the simulator charts as images.</w:t>
-      </w:r>
-    </w:p>
-    <w:p>
-      <w:r>
-        <w:br w:type="page"/>
-      </w:r>
-    </w:p>
-    <w:p>
-      <w:pPr>
-        <w:pStyle w:val="Heading1"/>
-      </w:pPr>
-      <w:r>
-        <w:rPr>
-          <w:color w:val="0F172A"/>
-        </w:rPr>
-        <w:t>8. Formal questions — your deliverables</w:t>
-      </w:r>
-    </w:p>
-    <w:p>
-      <w:r>
-        <w:rPr>
-          <w:b w:val="0"/>
-          <w:i/>
-          <w:sz w:val="22"/>
-        </w:rPr>
-        <w:t>Use the simulator to answer. For every question, take a screenshot or download the Excel and attach it as evidence.</w:t>
-      </w:r>
-    </w:p>
-    <w:p>
-      <w:r>
-        <w:rPr>
-          <w:b/>
-          <w:color w:val="F97316"/>
-        </w:rPr>
-        <w:t>Q8.1 — WTP &amp; optimum</w:t>
-      </w:r>
-    </w:p>
-    <w:p>
-      <w:r>
-        <w:t>For each combination (period × version), identify the peak-profit price. Is it closer to the top or the bottom of the WTP distribution? Why?</w:t>
-      </w:r>
-    </w:p>
-    <w:tbl>
-      <w:tblPr>
-        <w:tblW w:type="auto" w:w="0"/>
-        <w:tblLayout w:type="autofit"/>
-        <w:tblLook w:firstColumn="1" w:firstRow="1" w:lastColumn="0" w:lastRow="0" w:noHBand="0" w:noVBand="1" w:val="04A0"/>
-      </w:tblPr>
-      <w:tblGrid>
-        <w:gridCol w:w="8640"/>
-      </w:tblGrid>
-      <w:tr>
-        <w:tc>
-          <w:tcPr>
-            <w:tcW w:type="dxa" w:w="8640"/>
-            <w:shd w:fill="F8FAFC"/>
-          </w:tcPr>
-          <w:p>
-            <w:r>
-              <w:rPr>
-                <w:i/>
-                <w:color w:val="64748B"/>
-              </w:rPr>
-              <w:br/>
-              <w:br/>
-              <w:br/>
-              <w:br/>
-              <w:br/>
-              <w:br/>
-              <w:br/>
-            </w:r>
-          </w:p>
-        </w:tc>
-      </w:tr>
-    </w:tbl>
-    <w:p/>
-    <w:p>
-      <w:r>
-        <w:rPr>
-          <w:b/>
-          <w:color w:val="F97316"/>
-        </w:rPr>
-        <w:t>Q8.2 — Competitive positioning</w:t>
-      </w:r>
-    </w:p>
-    <w:p>
-      <w:r>
-        <w:t>Where does Nomade sit vs Further VAN, People Camper and Ocean Vans on each of the three periods? Drag the green line to a competitor's price using the Match-competitor button. What would our profit be? What would the acceptance rate be?</w:t>
-      </w:r>
-    </w:p>
-    <w:tbl>
-      <w:tblPr>
-        <w:tblW w:type="auto" w:w="0"/>
-        <w:tblLayout w:type="autofit"/>
-        <w:tblLook w:firstColumn="1" w:firstRow="1" w:lastColumn="0" w:lastRow="0" w:noHBand="0" w:noVBand="1" w:val="04A0"/>
-      </w:tblPr>
-      <w:tblGrid>
-        <w:gridCol w:w="8640"/>
-      </w:tblGrid>
-      <w:tr>
-        <w:tc>
-          <w:tcPr>
-            <w:tcW w:type="dxa" w:w="8640"/>
-            <w:shd w:fill="F8FAFC"/>
-          </w:tcPr>
-          <w:p>
-            <w:r>
-              <w:rPr>
-                <w:i/>
-                <w:color w:val="64748B"/>
-              </w:rPr>
-              <w:br/>
-              <w:br/>
-              <w:br/>
-              <w:br/>
-              <w:br/>
-              <w:br/>
-              <w:br/>
-            </w:r>
-          </w:p>
-        </w:tc>
-      </w:tr>
-    </w:tbl>
-    <w:p/>
-    <w:p>
-      <w:r>
-        <w:rPr>
-          <w:b/>
-          <w:color w:val="F97316"/>
-        </w:rPr>
-        <w:t>Q8.3 — Move up or move down?</w:t>
-      </w:r>
-    </w:p>
-    <w:p>
-      <w:r>
-        <w:t>On the Profit curve, is there a competitor whose price sits clearly above our current peak (i.e., moving up toward them would reduce profit)? And a competitor below our peak? Justify whether to move up, match, or stay.</w:t>
-      </w:r>
-    </w:p>
-    <w:tbl>
-      <w:tblPr>
-        <w:tblW w:type="auto" w:w="0"/>
-        <w:tblLayout w:type="autofit"/>
-        <w:tblLook w:firstColumn="1" w:firstRow="1" w:lastColumn="0" w:lastRow="0" w:noHBand="0" w:noVBand="1" w:val="04A0"/>
-      </w:tblPr>
-      <w:tblGrid>
-        <w:gridCol w:w="8640"/>
-      </w:tblGrid>
-      <w:tr>
-        <w:tc>
-          <w:tcPr>
-            <w:tcW w:type="dxa" w:w="8640"/>
-            <w:shd w:fill="F8FAFC"/>
-          </w:tcPr>
-          <w:p>
-            <w:r>
-              <w:rPr>
-                <w:i/>
-                <w:color w:val="64748B"/>
-              </w:rPr>
-              <w:br/>
-              <w:br/>
-              <w:br/>
-              <w:br/>
-              <w:br/>
-              <w:br/>
-              <w:br/>
-            </w:r>
-          </w:p>
-        </w:tc>
-      </w:tr>
-    </w:tbl>
-    <w:p/>
-    <w:p>
-      <w:r>
-        <w:rPr>
-          <w:b/>
-          <w:color w:val="F97316"/>
-        </w:rPr>
-        <w:t>Q8.4 — Anchoring</w:t>
-      </w:r>
-    </w:p>
-    <w:p>
-      <w:r>
-        <w:t>Design a three-tier menu (basic / middle / premium) for the Weekend period. Where do you place the middle to maximise acceptance of the target price?</w:t>
-      </w:r>
-    </w:p>
-    <w:tbl>
-      <w:tblPr>
-        <w:tblW w:type="auto" w:w="0"/>
-        <w:tblLayout w:type="autofit"/>
-        <w:tblLook w:firstColumn="1" w:firstRow="1" w:lastColumn="0" w:lastRow="0" w:noHBand="0" w:noVBand="1" w:val="04A0"/>
-      </w:tblPr>
-      <w:tblGrid>
-        <w:gridCol w:w="8640"/>
-      </w:tblGrid>
-      <w:tr>
-        <w:tc>
-          <w:tcPr>
-            <w:tcW w:type="dxa" w:w="8640"/>
-            <w:shd w:fill="F8FAFC"/>
-          </w:tcPr>
-          <w:p>
-            <w:r>
-              <w:rPr>
-                <w:i/>
-                <w:color w:val="64748B"/>
-              </w:rPr>
-              <w:br/>
-              <w:br/>
-              <w:br/>
-              <w:br/>
-              <w:br/>
-              <w:br/>
-              <w:br/>
-            </w:r>
-          </w:p>
-        </w:tc>
-      </w:tr>
-    </w:tbl>
-    <w:p/>
-    <w:p>
-      <w:r>
-        <w:rPr>
-          <w:b/>
-          <w:color w:val="F97316"/>
-        </w:rPr>
-        <w:t>Q8.5 — Charm pricing</w:t>
-      </w:r>
-    </w:p>
-    <w:p>
-      <w:r>
-        <w:t>Test €80 vs €79 (Daily Standard). How many additional rentals does the +7% perception uplift buy? Does profit increase? When is charm pricing counter-productive?</w:t>
-      </w:r>
-    </w:p>
-    <w:tbl>
-      <w:tblPr>
-        <w:tblW w:type="auto" w:w="0"/>
-        <w:tblLayout w:type="autofit"/>
-        <w:tblLook w:firstColumn="1" w:firstRow="1" w:lastColumn="0" w:lastRow="0" w:noHBand="0" w:noVBand="1" w:val="04A0"/>
-      </w:tblPr>
-      <w:tblGrid>
-        <w:gridCol w:w="8640"/>
-      </w:tblGrid>
-      <w:tr>
-        <w:tc>
-          <w:tcPr>
-            <w:tcW w:type="dxa" w:w="8640"/>
-            <w:shd w:fill="F8FAFC"/>
-          </w:tcPr>
-          <w:p>
-            <w:r>
-              <w:rPr>
-                <w:i/>
-                <w:color w:val="64748B"/>
-              </w:rPr>
-              <w:br/>
-              <w:br/>
-              <w:br/>
-              <w:br/>
-              <w:br/>
-              <w:br/>
-              <w:br/>
-            </w:r>
-          </w:p>
-        </w:tc>
-      </w:tr>
-    </w:tbl>
-    <w:p/>
-    <w:p>
-      <w:r>
-        <w:rPr>
-          <w:b/>
-          <w:color w:val="F97316"/>
-        </w:rPr>
-        <w:t>Q8.6 — Prospect Theory</w:t>
-      </w:r>
-    </w:p>
-    <w:p>
-      <w:r>
-        <w:t>If you are forced to raise prices next season by €10, how would you frame it to customers so that it feels less like a loss? Use the value function as argument.</w:t>
-      </w:r>
-    </w:p>
-    <w:tbl>
-      <w:tblPr>
-        <w:tblW w:type="auto" w:w="0"/>
-        <w:tblLayout w:type="autofit"/>
-        <w:tblLook w:firstColumn="1" w:firstRow="1" w:lastColumn="0" w:lastRow="0" w:noHBand="0" w:noVBand="1" w:val="04A0"/>
-      </w:tblPr>
-      <w:tblGrid>
-        <w:gridCol w:w="8640"/>
-      </w:tblGrid>
-      <w:tr>
-        <w:tc>
-          <w:tcPr>
-            <w:tcW w:type="dxa" w:w="8640"/>
-            <w:shd w:fill="F8FAFC"/>
-          </w:tcPr>
-          <w:p>
-            <w:r>
-              <w:rPr>
-                <w:i/>
-                <w:color w:val="64748B"/>
-              </w:rPr>
-              <w:br/>
-              <w:br/>
-              <w:br/>
-              <w:br/>
-              <w:br/>
-              <w:br/>
-              <w:br/>
-            </w:r>
-          </w:p>
-        </w:tc>
-      </w:tr>
-    </w:tbl>
-    <w:p/>
-    <w:p>
-      <w:r>
-        <w:rPr>
-          <w:b/>
-          <w:color w:val="F97316"/>
-        </w:rPr>
-        <w:t>Q8.7 — Reference price</w:t>
-      </w:r>
-    </w:p>
-    <w:p>
-      <w:r>
-        <w:t>Set the reference price at the cheapest competitor. What share of respondents are above? What does that share mean for Nomade's positioning strategy?</w:t>
-      </w:r>
-    </w:p>
-    <w:tbl>
-      <w:tblPr>
-        <w:tblW w:type="auto" w:w="0"/>
-        <w:tblLayout w:type="autofit"/>
-        <w:tblLook w:firstColumn="1" w:firstRow="1" w:lastColumn="0" w:lastRow="0" w:noHBand="0" w:noVBand="1" w:val="04A0"/>
-      </w:tblPr>
-      <w:tblGrid>
-        <w:gridCol w:w="8640"/>
-      </w:tblGrid>
-      <w:tr>
-        <w:tc>
-          <w:tcPr>
-            <w:tcW w:type="dxa" w:w="8640"/>
-            <w:shd w:fill="F8FAFC"/>
-          </w:tcPr>
-          <w:p>
-            <w:r>
-              <w:rPr>
-                <w:i/>
-                <w:color w:val="64748B"/>
-              </w:rPr>
-              <w:br/>
-              <w:br/>
-              <w:br/>
-              <w:br/>
-              <w:br/>
-              <w:br/>
-              <w:br/>
-            </w:r>
-          </w:p>
-        </w:tc>
-      </w:tr>
-    </w:tbl>
-    <w:p/>
-    <w:p>
-      <w:r>
-        <w:rPr>
-          <w:b/>
-          <w:color w:val="F97316"/>
-        </w:rPr>
-        <w:t>Q8.8 — Final recommendation</w:t>
-      </w:r>
-    </w:p>
-    <w:p>
-      <w:r>
-        <w:t>Propose a price for each period × version. Write the analyst note inside the simulator, download the Excel, and attach a one-paragraph justification per decision.</w:t>
-      </w:r>
-    </w:p>
-    <w:tbl>
-      <w:tblPr>
-        <w:tblW w:type="auto" w:w="0"/>
-        <w:tblLayout w:type="autofit"/>
-        <w:tblLook w:firstColumn="1" w:firstRow="1" w:lastColumn="0" w:lastRow="0" w:noHBand="0" w:noVBand="1" w:val="04A0"/>
-      </w:tblPr>
-      <w:tblGrid>
-        <w:gridCol w:w="8640"/>
-      </w:tblGrid>
-      <w:tr>
-        <w:tc>
-          <w:tcPr>
-            <w:tcW w:type="dxa" w:w="8640"/>
-            <w:shd w:fill="F8FAFC"/>
-          </w:tcPr>
-          <w:p>
-            <w:r>
-              <w:rPr>
-                <w:i/>
-                <w:color w:val="64748B"/>
-              </w:rPr>
-              <w:br/>
-              <w:br/>
-              <w:br/>
-              <w:br/>
-              <w:br/>
-              <w:br/>
-              <w:br/>
-            </w:r>
-          </w:p>
-        </w:tc>
-      </w:tr>
-    </w:tbl>
-    <w:p/>
-    <w:p>
-      <w:pPr>
-        <w:pStyle w:val="Heading1"/>
-      </w:pPr>
-      <w:r>
-        <w:rPr>
-          <w:color w:val="0F172A"/>
-        </w:rPr>
-        <w:t>9. Evaluation criteria</w:t>
-      </w:r>
-    </w:p>
-    <w:p>
-      <w:pPr>
-        <w:pStyle w:val="ListBullet"/>
-      </w:pPr>
-      <w:r>
-        <w:t>Rigour — use of the simulator (drag evidence, screenshots).</w:t>
-      </w:r>
-    </w:p>
-    <w:p>
-      <w:pPr>
-        <w:pStyle w:val="ListBullet"/>
-      </w:pPr>
-      <w:r>
-        <w:t>Integration — competition + WTP + psychological factors combined into a coherent recommendation.</w:t>
-      </w:r>
-    </w:p>
-    <w:p>
-      <w:pPr>
-        <w:pStyle w:val="ListBullet"/>
-      </w:pPr>
-      <w:r>
-        <w:t>Clarity — clean writing, numbers justified, trade-offs explicit.</w:t>
-      </w:r>
-    </w:p>
-    <w:p>
-      <w:pPr>
-        <w:pStyle w:val="ListBullet"/>
-      </w:pPr>
-      <w:r>
-        <w:t>Attached Excel export with the final position included.</w:t>
-      </w:r>
-    </w:p>
-    <w:p>
-      <w:r>
-        <w:br w:type="page"/>
-      </w:r>
-    </w:p>
-    <w:p>
-      <w:pPr>
-        <w:pStyle w:val="Heading1"/>
-      </w:pPr>
-      <w:r>
-        <w:rPr>
-          <w:color w:val="0F172A"/>
-        </w:rPr>
-        <w:t>Deliverables</w:t>
-      </w:r>
-    </w:p>
-    <w:p>
-      <w:pPr>
-        <w:pStyle w:val="ListNumber"/>
-      </w:pPr>
-      <w:r>
-        <w:t>This workbook (Word), with every answer box filled in.</w:t>
-      </w:r>
-    </w:p>
-    <w:p>
-      <w:pPr>
-        <w:pStyle w:val="ListNumber"/>
-      </w:pPr>
-      <w:r>
-        <w:t>The Excel export (.xlsx) downloaded from the simulator with your final position.</w:t>
-      </w:r>
-    </w:p>
-    <w:p>
-      <w:pPr>
-        <w:pStyle w:val="ListNumber"/>
-      </w:pPr>
-      <w:r>
-        <w:t>A one-page executive summary of your price recommendation.</w:t>
+        <w:t>A one-page executive summary of your pricing recommendation.</w:t>
       </w:r>
     </w:p>
     <w:sectPr>

</xml_diff>

<commit_message>
Add Case-answers tab (3 formal Nomade v2.0 questions), case story + data-incomplete note; Excel now includes Case answers sheet; Word doc rewritten with story, data note, 3 formal questions, 13 items as reference appendix
</commit_message>
<xml_diff>
--- a/Nomade_Vans_Case_Study_Simulator_Edition.docx
+++ b/Nomade_Vans_Case_Study_Simulator_Edition.docx
@@ -38,7 +38,7 @@
           <w:color w:val="64748B"/>
           <w:sz w:val="24"/>
         </w:rPr>
-        <w:t>Simulator-driven edition · v3.0 — student workbook</w:t>
+        <w:t>Simulator-driven edition · v3.1 — student workbook</w:t>
       </w:r>
     </w:p>
     <w:p/>
@@ -80,7 +80,7 @@
         <w:rPr>
           <w:color w:val="0F172A"/>
         </w:rPr>
-        <w:t>1. Caso · Case background</w:t>
+        <w:t>1. The story · El caso</w:t>
       </w:r>
     </w:p>
     <w:p>
@@ -90,17 +90,7 @@
           <w:i w:val="0"/>
           <w:sz w:val="22"/>
         </w:rPr>
-        <w:t>Nomade Vans es una empresa española que se centra en el diseño y la «camperización» de furgonetas sostenibles. Permite a los consumidores personalizar el producto a través de su web y se ha planteado una nueva línea de negocio: el alquiler de camper vans.</w:t>
-      </w:r>
-    </w:p>
-    <w:p>
-      <w:r>
-        <w:rPr>
-          <w:b w:val="0"/>
-          <w:i/>
-          <w:sz w:val="20"/>
-        </w:rPr>
-        <w:t>Two service tiers are proposed: Standard Camper Rental and Premium Camper Rental (hybrid model, extra bed, indoor shower, air conditioning, solar power, extra kitchenware). Rentals are offered by day, weekend (2 nights) and week (6 nights). The combination gives a 2×3 price structure.</w:t>
+        <w:t>Nomade Vans es una empresa española que se centra en el diseño y la «camperización» de furgonetas sostenibles. Permite a los consumidores personalizar el producto a través de su web y promete cumplir con un plazo de entrega de un mes. A diferencia de otras empresas del sector, emplea un diseño único y coherente con los valores de sostenibilidad y el entorno natural.</w:t>
       </w:r>
     </w:p>
     <w:p>
@@ -110,9 +100,50 @@
           <w:i w:val="0"/>
           <w:sz w:val="22"/>
         </w:rPr>
-        <w:t>A WTP survey was carried out with 95 respondents. Three competitors have been identified in the relevant market: Further VAN experience, People Camper and Ocean Vans. The simulator reproduces the WTP distribution, profit curves, competitor positioning and the main psychological factors from the technical notes.</w:t>
+        <w:t>Tras diseñar y camperizar furgonetas para la venta directa, se plantea la posibilidad de iniciar una nueva línea de negocio basada en el alquiler de camper vans. Para ello se establecen dos niveles de servicio — Standard y Premium — y tres métricas temporales — día, fin de semana (2 noches) y semana (6 noches). La combinación de tiers y periodos define una estructura de precios 2 × 3.</w:t>
       </w:r>
     </w:p>
+    <w:p>
+      <w:r>
+        <w:rPr>
+          <w:b w:val="0"/>
+          <w:i/>
+          <w:color w:val="64748B"/>
+          <w:sz w:val="20"/>
+        </w:rPr>
+        <w:t>Nomade Vans is a Spanish start-up designing sustainable camperised vans. Two service tiers (Standard and Premium) and three rental periods (Day / Weekend / Week) define the price structure. To calibrate willingness-to-pay the team surveyed 95 people, and marketing identified three competitors — Further VAN experience, People Camper and Ocean Vans — currently operating only with daily tariffs.</w:t>
+      </w:r>
+    </w:p>
+    <w:tbl>
+      <w:tblPr>
+        <w:tblW w:type="auto" w:w="0"/>
+        <w:tblLook w:firstColumn="1" w:firstRow="1" w:lastColumn="0" w:lastRow="0" w:noHBand="0" w:noVBand="1" w:val="04A0"/>
+      </w:tblPr>
+      <w:tblGrid>
+        <w:gridCol w:w="8640"/>
+      </w:tblGrid>
+      <w:tr>
+        <w:tc>
+          <w:tcPr>
+            <w:tcW w:type="dxa" w:w="8640"/>
+            <w:shd w:fill="FEF3C7"/>
+          </w:tcPr>
+          <w:p>
+            <w:r>
+              <w:rPr>
+                <w:b/>
+                <w:color w:val="92400E"/>
+              </w:rPr>
+              <w:t xml:space="preserve">⚠ Data note — dataset is incomplete  </w:t>
+            </w:r>
+            <w:r>
+              <w:t>The three competitors publish DAILY tariffs only. Weekend and weekly prices shown throughout the simulator are ESTIMATES aggregated from the daily tariff (weekend ≈ −5 % per day, week ≈ −30 % per day). Treat them as reference scenarios, not observed data. Any number can be overridden on the Position &amp; prices tab. The Nomade WTP data itself is real (95 respondents).</w:t>
+            </w:r>
+          </w:p>
+        </w:tc>
+      </w:tr>
+    </w:tbl>
+    <w:p/>
     <w:p>
       <w:pPr>
         <w:pStyle w:val="Heading1"/>
@@ -121,7 +152,7 @@
         <w:rPr>
           <w:color w:val="0F172A"/>
         </w:rPr>
-        <w:t>2. Estructura de precios óptimos sin segmentar (Nomade v2.0 · baseline)</w:t>
+        <w:t>2. Estructura de precios óptimos sin segmentar (Nomade v2.0 baseline)</w:t>
       </w:r>
     </w:p>
     <w:tbl>
@@ -172,7 +203,7 @@
               <w:rPr>
                 <w:b/>
               </w:rPr>
-              <w:t>Weekend</w:t>
+              <w:t>Weekend (total)</w:t>
             </w:r>
           </w:p>
         </w:tc>
@@ -185,7 +216,7 @@
               <w:rPr>
                 <w:b/>
               </w:rPr>
-              <w:t>Week</w:t>
+              <w:t>Week (total)</w:t>
             </w:r>
           </w:p>
         </w:tc>
@@ -198,7 +229,7 @@
               <w:rPr>
                 <w:b/>
               </w:rPr>
-              <w:t>Weekly (per day)</w:t>
+              <w:t>Per-day price</w:t>
             </w:r>
           </w:p>
         </w:tc>
@@ -230,7 +261,7 @@
           </w:tcPr>
           <w:p>
             <w:r>
-              <w:t>120 € / 60 €/day</w:t>
+              <w:t>120 €</w:t>
             </w:r>
           </w:p>
         </w:tc>
@@ -250,7 +281,7 @@
           </w:tcPr>
           <w:p>
             <w:r>
-              <w:t>60 €</w:t>
+              <w:t>60 € weekend / 60 € week</w:t>
             </w:r>
           </w:p>
         </w:tc>
@@ -282,7 +313,7 @@
           </w:tcPr>
           <w:p>
             <w:r>
-              <w:t>160 € / 80 €/day</w:t>
+              <w:t>160 €</w:t>
             </w:r>
           </w:p>
         </w:tc>
@@ -302,7 +333,7 @@
           </w:tcPr>
           <w:p>
             <w:r>
-              <w:t>77 €</w:t>
+              <w:t>80 € weekend / 77 € week</w:t>
             </w:r>
           </w:p>
         </w:tc>
@@ -475,6 +506,7 @@
         <w:rPr>
           <w:b w:val="0"/>
           <w:i/>
+          <w:color w:val="64748B"/>
           <w:sz w:val="20"/>
         </w:rPr>
         <w:t>Demand scaling: day × 1.0, weekend × 0.365 (≈ 182 rentals/year), week × 0.0743 (≈ 52 rentals/year).</w:t>
@@ -488,7 +520,7 @@
         <w:rPr>
           <w:color w:val="0F172A"/>
         </w:rPr>
-        <w:t>4. Competidores (precios de referencia diario)</w:t>
+        <w:t>4. Competidores · Competitors (daily tariff — the only one published)</w:t>
       </w:r>
     </w:p>
     <w:tbl>
@@ -642,16 +674,6 @@
     </w:tbl>
     <w:p/>
     <w:p>
-      <w:r>
-        <w:rPr>
-          <w:b w:val="0"/>
-          <w:i/>
-          <w:sz w:val="20"/>
-        </w:rPr>
-        <w:t>All three competitors operate only by day. Weekend and weekly tariffs in the simulator are estimated (−5 % and −30 % respectively), as reference scenarios.</w:t>
-      </w:r>
-    </w:p>
-    <w:p>
       <w:pPr>
         <w:pStyle w:val="Heading1"/>
       </w:pPr>
@@ -684,7 +706,7 @@
         <w:pStyle w:val="ListNumber"/>
       </w:pPr>
       <w:r>
-        <w:t>Select period (Daily / Weekend / Week) and version (Standard / Premium) at the top. Everything updates.</w:t>
+        <w:t>Pick a rental period (Day / Weekend / Week) and a version (Standard / Premium) at the top.</w:t>
       </w:r>
     </w:p>
     <w:p>
@@ -692,7 +714,7 @@
         <w:pStyle w:val="ListNumber"/>
       </w:pPr>
       <w:r>
-        <w:t>On Competition-based → Profit curve, DRAG the green "Our price" line. Coloured dashed lines are competitors. KPIs (profit, demand, revenue, lost-vs-peak) update live. Use Match-competitor / Snap-to-peak buttons for quick moves.</w:t>
+        <w:t>Go to Competition-based → Profit curve. DRAG the green "Our price" line. Coloured dashed lines are the three competitors; KPIs (profit, demand, revenue, lost-vs-peak) update live. Use Match-competitor / Snap-to-peak.</w:t>
       </w:r>
     </w:p>
     <w:p>
@@ -700,7 +722,7 @@
         <w:pStyle w:val="ListNumber"/>
       </w:pPr>
       <w:r>
-        <w:t>On Psychological factors, all inputs are pre-loaded from your current position. Experiment with Anchoring (good-better-best), Charm pricing (€80 vs €79), Prospect Theory (before/after price, perceived pain/gain) and Reference price (cheapest competitor by default). Use Apply-to-position buttons to push a tested number back into Position &amp; prices.</w:t>
+        <w:t>Go to Psychological factors — all inputs are pre-loaded from your current position. Experiment (Anchoring, Charm, Prospect Theory before/after price, Reference). Use Apply-to-Standard / Apply-to-Premium buttons to push a tested number back into Position &amp; prices.</w:t>
       </w:r>
     </w:p>
     <w:p>
@@ -708,7 +730,7 @@
         <w:pStyle w:val="ListNumber"/>
       </w:pPr>
       <w:r>
-        <w:t>On Position &amp; prices you see the same interactive chart and full numeric inputs for every period. Add the analyst note.</w:t>
+        <w:t>Open Position &amp; prices to type numbers directly and add the analyst note.</w:t>
       </w:r>
     </w:p>
     <w:p>
@@ -716,7 +738,15 @@
         <w:pStyle w:val="ListNumber"/>
       </w:pPr>
       <w:r>
-        <w:t>On Download Excel, one click produces a .xlsx with 7 sheets: Guide, Questions, Answers (Day / Weekend / Week), Position and Charts (all 9 charts embedded as images).</w:t>
+        <w:t>Open Case answers — the three formal questions are there; write your answer in each box.</w:t>
+      </w:r>
+    </w:p>
+    <w:p>
+      <w:pPr>
+        <w:pStyle w:val="ListNumber"/>
+      </w:pPr>
+      <w:r>
+        <w:t>Open Download Excel. One click produces a .xlsx with 8 sheets including Case answers and all 9 charts embedded as images.</w:t>
       </w:r>
     </w:p>
     <w:p>
@@ -732,7 +762,7 @@
         <w:rPr>
           <w:color w:val="0F172A"/>
         </w:rPr>
-        <w:t>6. La encuesta · The 13 survey questions</w:t>
+        <w:t>6. Preguntas del caso · Formal deliverable questions</w:t>
       </w:r>
     </w:p>
     <w:p>
@@ -742,605 +772,7 @@
           <w:i/>
           <w:sz w:val="22"/>
         </w:rPr>
-        <w:t>Before interpreting the aggregated data, answer the 13 questions as if you were one of the 95 respondents. Items 1–7 build the buyer profile; items 8–13 are the WTP measurements. Phrasing is the original Spanish from the questionnaire, with English translation below.</w:t>
-      </w:r>
-    </w:p>
-    <w:p>
-      <w:r>
-        <w:rPr>
-          <w:b/>
-        </w:rPr>
-        <w:t xml:space="preserve">Q1. </w:t>
-      </w:r>
-      <w:r>
-        <w:t>Por favor, indique su género.</w:t>
-      </w:r>
-    </w:p>
-    <w:p>
-      <w:r>
-        <w:rPr>
-          <w:i/>
-          <w:color w:val="64748B"/>
-        </w:rPr>
-        <w:t>(Please indicate your gender.)</w:t>
-      </w:r>
-    </w:p>
-    <w:tbl>
-      <w:tblPr>
-        <w:tblW w:type="auto" w:w="0"/>
-        <w:tblLayout w:type="autofit"/>
-        <w:tblLook w:firstColumn="1" w:firstRow="1" w:lastColumn="0" w:lastRow="0" w:noHBand="0" w:noVBand="1" w:val="04A0"/>
-      </w:tblPr>
-      <w:tblGrid>
-        <w:gridCol w:w="8640"/>
-      </w:tblGrid>
-      <w:tr>
-        <w:tc>
-          <w:tcPr>
-            <w:tcW w:type="dxa" w:w="8640"/>
-            <w:shd w:fill="F8FAFC"/>
-          </w:tcPr>
-          <w:p>
-            <w:r>
-              <w:br/>
-            </w:r>
-          </w:p>
-        </w:tc>
-      </w:tr>
-    </w:tbl>
-    <w:p/>
-    <w:p>
-      <w:r>
-        <w:rPr>
-          <w:b/>
-        </w:rPr>
-        <w:t xml:space="preserve">Q2. </w:t>
-      </w:r>
-      <w:r>
-        <w:t>¿En qué rango de edad se encuentra?  &lt;20 / 20-30 / 30-40 / 40-50 / 50-60 / &gt;60</w:t>
-      </w:r>
-    </w:p>
-    <w:p>
-      <w:r>
-        <w:rPr>
-          <w:i/>
-          <w:color w:val="64748B"/>
-        </w:rPr>
-        <w:t>(What age range are you in?)</w:t>
-      </w:r>
-    </w:p>
-    <w:tbl>
-      <w:tblPr>
-        <w:tblW w:type="auto" w:w="0"/>
-        <w:tblLayout w:type="autofit"/>
-        <w:tblLook w:firstColumn="1" w:firstRow="1" w:lastColumn="0" w:lastRow="0" w:noHBand="0" w:noVBand="1" w:val="04A0"/>
-      </w:tblPr>
-      <w:tblGrid>
-        <w:gridCol w:w="8640"/>
-      </w:tblGrid>
-      <w:tr>
-        <w:tc>
-          <w:tcPr>
-            <w:tcW w:type="dxa" w:w="8640"/>
-            <w:shd w:fill="F8FAFC"/>
-          </w:tcPr>
-          <w:p>
-            <w:r>
-              <w:br/>
-            </w:r>
-          </w:p>
-        </w:tc>
-      </w:tr>
-    </w:tbl>
-    <w:p/>
-    <w:p>
-      <w:r>
-        <w:rPr>
-          <w:b/>
-        </w:rPr>
-        <w:t xml:space="preserve">Q3. </w:t>
-      </w:r>
-      <w:r>
-        <w:t>¿Cuál es su estado civil?  Soltero / Casado / Divorciado / Viudo</w:t>
-      </w:r>
-    </w:p>
-    <w:p>
-      <w:r>
-        <w:rPr>
-          <w:i/>
-          <w:color w:val="64748B"/>
-        </w:rPr>
-        <w:t>(What is your civil status?)</w:t>
-      </w:r>
-    </w:p>
-    <w:tbl>
-      <w:tblPr>
-        <w:tblW w:type="auto" w:w="0"/>
-        <w:tblLayout w:type="autofit"/>
-        <w:tblLook w:firstColumn="1" w:firstRow="1" w:lastColumn="0" w:lastRow="0" w:noHBand="0" w:noVBand="1" w:val="04A0"/>
-      </w:tblPr>
-      <w:tblGrid>
-        <w:gridCol w:w="8640"/>
-      </w:tblGrid>
-      <w:tr>
-        <w:tc>
-          <w:tcPr>
-            <w:tcW w:type="dxa" w:w="8640"/>
-            <w:shd w:fill="F8FAFC"/>
-          </w:tcPr>
-          <w:p>
-            <w:r>
-              <w:br/>
-            </w:r>
-          </w:p>
-        </w:tc>
-      </w:tr>
-    </w:tbl>
-    <w:p/>
-    <w:p>
-      <w:r>
-        <w:rPr>
-          <w:b/>
-        </w:rPr>
-        <w:t xml:space="preserve">Q4. </w:t>
-      </w:r>
-      <w:r>
-        <w:t>¿Cuál es su nivel de educación?  Primaria / Secundaria / Grado Universitario / Máster o Posgrado</w:t>
-      </w:r>
-    </w:p>
-    <w:p>
-      <w:r>
-        <w:rPr>
-          <w:i/>
-          <w:color w:val="64748B"/>
-        </w:rPr>
-        <w:t>(What is your level of education?)</w:t>
-      </w:r>
-    </w:p>
-    <w:tbl>
-      <w:tblPr>
-        <w:tblW w:type="auto" w:w="0"/>
-        <w:tblLayout w:type="autofit"/>
-        <w:tblLook w:firstColumn="1" w:firstRow="1" w:lastColumn="0" w:lastRow="0" w:noHBand="0" w:noVBand="1" w:val="04A0"/>
-      </w:tblPr>
-      <w:tblGrid>
-        <w:gridCol w:w="8640"/>
-      </w:tblGrid>
-      <w:tr>
-        <w:tc>
-          <w:tcPr>
-            <w:tcW w:type="dxa" w:w="8640"/>
-            <w:shd w:fill="F8FAFC"/>
-          </w:tcPr>
-          <w:p>
-            <w:r>
-              <w:br/>
-            </w:r>
-          </w:p>
-        </w:tc>
-      </w:tr>
-    </w:tbl>
-    <w:p/>
-    <w:p>
-      <w:r>
-        <w:rPr>
-          <w:b/>
-        </w:rPr>
-        <w:t xml:space="preserve">Q5. </w:t>
-      </w:r>
-      <w:r>
-        <w:t>Seleccione su situación laboral.  Empleado / Autónomo / Desempleado / Jubilado / Estudiante</w:t>
-      </w:r>
-    </w:p>
-    <w:p>
-      <w:r>
-        <w:rPr>
-          <w:i/>
-          <w:color w:val="64748B"/>
-        </w:rPr>
-        <w:t>(Select your employment status.)</w:t>
-      </w:r>
-    </w:p>
-    <w:tbl>
-      <w:tblPr>
-        <w:tblW w:type="auto" w:w="0"/>
-        <w:tblLayout w:type="autofit"/>
-        <w:tblLook w:firstColumn="1" w:firstRow="1" w:lastColumn="0" w:lastRow="0" w:noHBand="0" w:noVBand="1" w:val="04A0"/>
-      </w:tblPr>
-      <w:tblGrid>
-        <w:gridCol w:w="8640"/>
-      </w:tblGrid>
-      <w:tr>
-        <w:tc>
-          <w:tcPr>
-            <w:tcW w:type="dxa" w:w="8640"/>
-            <w:shd w:fill="F8FAFC"/>
-          </w:tcPr>
-          <w:p>
-            <w:r>
-              <w:br/>
-            </w:r>
-          </w:p>
-        </w:tc>
-      </w:tr>
-    </w:tbl>
-    <w:p/>
-    <w:p>
-      <w:r>
-        <w:rPr>
-          <w:b/>
-        </w:rPr>
-        <w:t xml:space="preserve">Q6. </w:t>
-      </w:r>
-      <w:r>
-        <w:t>¿Qué le gusta hacer en su tiempo libre? (Puede marcar más de una respuesta)  Viajar · Leer · Practicar algún deporte · Realizar actividades de aventura · Pasar tiempo en familia · Otras</w:t>
-      </w:r>
-    </w:p>
-    <w:p>
-      <w:r>
-        <w:rPr>
-          <w:i/>
-          <w:color w:val="64748B"/>
-        </w:rPr>
-        <w:t>(What do you like to do in your free time? Multiple answers allowed.)</w:t>
-      </w:r>
-    </w:p>
-    <w:tbl>
-      <w:tblPr>
-        <w:tblW w:type="auto" w:w="0"/>
-        <w:tblLayout w:type="autofit"/>
-        <w:tblLook w:firstColumn="1" w:firstRow="1" w:lastColumn="0" w:lastRow="0" w:noHBand="0" w:noVBand="1" w:val="04A0"/>
-      </w:tblPr>
-      <w:tblGrid>
-        <w:gridCol w:w="8640"/>
-      </w:tblGrid>
-      <w:tr>
-        <w:tc>
-          <w:tcPr>
-            <w:tcW w:type="dxa" w:w="8640"/>
-            <w:shd w:fill="F8FAFC"/>
-          </w:tcPr>
-          <w:p>
-            <w:r>
-              <w:br/>
-            </w:r>
-          </w:p>
-        </w:tc>
-      </w:tr>
-    </w:tbl>
-    <w:p/>
-    <w:p>
-      <w:r>
-        <w:rPr>
-          <w:b/>
-        </w:rPr>
-        <w:t xml:space="preserve">Q7. </w:t>
-      </w:r>
-      <w:r>
-        <w:t>¿Cuántos días sueles irte de vacaciones?  Menos de 3 días / Entre 3 y 5 días / Entre 5 y 7 días / Más de una semana</w:t>
-      </w:r>
-    </w:p>
-    <w:p>
-      <w:r>
-        <w:rPr>
-          <w:i/>
-          <w:color w:val="64748B"/>
-        </w:rPr>
-        <w:t>(How many days do you usually go on vacation?)</w:t>
-      </w:r>
-    </w:p>
-    <w:tbl>
-      <w:tblPr>
-        <w:tblW w:type="auto" w:w="0"/>
-        <w:tblLayout w:type="autofit"/>
-        <w:tblLook w:firstColumn="1" w:firstRow="1" w:lastColumn="0" w:lastRow="0" w:noHBand="0" w:noVBand="1" w:val="04A0"/>
-      </w:tblPr>
-      <w:tblGrid>
-        <w:gridCol w:w="8640"/>
-      </w:tblGrid>
-      <w:tr>
-        <w:tc>
-          <w:tcPr>
-            <w:tcW w:type="dxa" w:w="8640"/>
-            <w:shd w:fill="F8FAFC"/>
-          </w:tcPr>
-          <w:p>
-            <w:r>
-              <w:br/>
-            </w:r>
-          </w:p>
-        </w:tc>
-      </w:tr>
-    </w:tbl>
-    <w:p/>
-    <w:p>
-      <w:r>
-        <w:rPr>
-          <w:b/>
-        </w:rPr>
-        <w:t xml:space="preserve">Q8. </w:t>
-      </w:r>
-      <w:r>
-        <w:t>¿Cuál es el precio máximo que estás dispuesto a pagar por el alquiler de una camper ESTÁNDAR al día?  (50 / 60 / 70 / 80 / 90 / 100 / 110 / 120 / 130 €)</w:t>
-      </w:r>
-    </w:p>
-    <w:p>
-      <w:r>
-        <w:rPr>
-          <w:i/>
-          <w:color w:val="64748B"/>
-        </w:rPr>
-        <w:t>(Max price per day — Standard.)</w:t>
-      </w:r>
-    </w:p>
-    <w:tbl>
-      <w:tblPr>
-        <w:tblW w:type="auto" w:w="0"/>
-        <w:tblLayout w:type="autofit"/>
-        <w:tblLook w:firstColumn="1" w:firstRow="1" w:lastColumn="0" w:lastRow="0" w:noHBand="0" w:noVBand="1" w:val="04A0"/>
-      </w:tblPr>
-      <w:tblGrid>
-        <w:gridCol w:w="8640"/>
-      </w:tblGrid>
-      <w:tr>
-        <w:tc>
-          <w:tcPr>
-            <w:tcW w:type="dxa" w:w="8640"/>
-            <w:shd w:fill="F8FAFC"/>
-          </w:tcPr>
-          <w:p>
-            <w:r>
-              <w:br/>
-            </w:r>
-          </w:p>
-        </w:tc>
-      </w:tr>
-    </w:tbl>
-    <w:p/>
-    <w:p>
-      <w:r>
-        <w:rPr>
-          <w:b/>
-        </w:rPr>
-        <w:t xml:space="preserve">Q9. </w:t>
-      </w:r>
-      <w:r>
-        <w:t>¿Cuál es el precio máximo que estás dispuesto a pagar por el alquiler de una camper ESTÁNDAR durante un fin de semana (2 noches)?</w:t>
-      </w:r>
-    </w:p>
-    <w:p>
-      <w:r>
-        <w:rPr>
-          <w:i/>
-          <w:color w:val="64748B"/>
-        </w:rPr>
-        <w:t>(Max price per weekend — 2 nights — Standard.)</w:t>
-      </w:r>
-    </w:p>
-    <w:tbl>
-      <w:tblPr>
-        <w:tblW w:type="auto" w:w="0"/>
-        <w:tblLayout w:type="autofit"/>
-        <w:tblLook w:firstColumn="1" w:firstRow="1" w:lastColumn="0" w:lastRow="0" w:noHBand="0" w:noVBand="1" w:val="04A0"/>
-      </w:tblPr>
-      <w:tblGrid>
-        <w:gridCol w:w="8640"/>
-      </w:tblGrid>
-      <w:tr>
-        <w:tc>
-          <w:tcPr>
-            <w:tcW w:type="dxa" w:w="8640"/>
-            <w:shd w:fill="F8FAFC"/>
-          </w:tcPr>
-          <w:p>
-            <w:r>
-              <w:br/>
-            </w:r>
-          </w:p>
-        </w:tc>
-      </w:tr>
-    </w:tbl>
-    <w:p/>
-    <w:p>
-      <w:r>
-        <w:rPr>
-          <w:b/>
-        </w:rPr>
-        <w:t xml:space="preserve">Q10. </w:t>
-      </w:r>
-      <w:r>
-        <w:t>¿Cuál es el precio máximo que estás dispuesto a pagar por el alquiler de una camper ESTÁNDAR durante una semana (6 noches)?</w:t>
-      </w:r>
-    </w:p>
-    <w:p>
-      <w:r>
-        <w:rPr>
-          <w:i/>
-          <w:color w:val="64748B"/>
-        </w:rPr>
-        <w:t>(Max price per week — 6 nights — Standard.)</w:t>
-      </w:r>
-    </w:p>
-    <w:tbl>
-      <w:tblPr>
-        <w:tblW w:type="auto" w:w="0"/>
-        <w:tblLayout w:type="autofit"/>
-        <w:tblLook w:firstColumn="1" w:firstRow="1" w:lastColumn="0" w:lastRow="0" w:noHBand="0" w:noVBand="1" w:val="04A0"/>
-      </w:tblPr>
-      <w:tblGrid>
-        <w:gridCol w:w="8640"/>
-      </w:tblGrid>
-      <w:tr>
-        <w:tc>
-          <w:tcPr>
-            <w:tcW w:type="dxa" w:w="8640"/>
-            <w:shd w:fill="F8FAFC"/>
-          </w:tcPr>
-          <w:p>
-            <w:r>
-              <w:br/>
-            </w:r>
-          </w:p>
-        </w:tc>
-      </w:tr>
-    </w:tbl>
-    <w:p/>
-    <w:p>
-      <w:r>
-        <w:rPr>
-          <w:b/>
-        </w:rPr>
-        <w:t xml:space="preserve">Q11. </w:t>
-      </w:r>
-      <w:r>
-        <w:t>¿Cuál es el precio máximo que estás dispuesto a pagar por el alquiler de la camper PREMIUM al día?</w:t>
-      </w:r>
-    </w:p>
-    <w:p>
-      <w:r>
-        <w:rPr>
-          <w:i/>
-          <w:color w:val="64748B"/>
-        </w:rPr>
-        <w:t>(Max price per day — Premium.)</w:t>
-      </w:r>
-    </w:p>
-    <w:tbl>
-      <w:tblPr>
-        <w:tblW w:type="auto" w:w="0"/>
-        <w:tblLayout w:type="autofit"/>
-        <w:tblLook w:firstColumn="1" w:firstRow="1" w:lastColumn="0" w:lastRow="0" w:noHBand="0" w:noVBand="1" w:val="04A0"/>
-      </w:tblPr>
-      <w:tblGrid>
-        <w:gridCol w:w="8640"/>
-      </w:tblGrid>
-      <w:tr>
-        <w:tc>
-          <w:tcPr>
-            <w:tcW w:type="dxa" w:w="8640"/>
-            <w:shd w:fill="F8FAFC"/>
-          </w:tcPr>
-          <w:p>
-            <w:r>
-              <w:br/>
-            </w:r>
-          </w:p>
-        </w:tc>
-      </w:tr>
-    </w:tbl>
-    <w:p/>
-    <w:p>
-      <w:r>
-        <w:rPr>
-          <w:b/>
-        </w:rPr>
-        <w:t xml:space="preserve">Q12. </w:t>
-      </w:r>
-      <w:r>
-        <w:t>¿Cuál es el precio máximo que estás dispuesto a pagar por el alquiler de una camper PREMIUM durante un fin de semana (2 noches)?</w:t>
-      </w:r>
-    </w:p>
-    <w:p>
-      <w:r>
-        <w:rPr>
-          <w:i/>
-          <w:color w:val="64748B"/>
-        </w:rPr>
-        <w:t>(Max price per weekend — 2 nights — Premium.)</w:t>
-      </w:r>
-    </w:p>
-    <w:tbl>
-      <w:tblPr>
-        <w:tblW w:type="auto" w:w="0"/>
-        <w:tblLayout w:type="autofit"/>
-        <w:tblLook w:firstColumn="1" w:firstRow="1" w:lastColumn="0" w:lastRow="0" w:noHBand="0" w:noVBand="1" w:val="04A0"/>
-      </w:tblPr>
-      <w:tblGrid>
-        <w:gridCol w:w="8640"/>
-      </w:tblGrid>
-      <w:tr>
-        <w:tc>
-          <w:tcPr>
-            <w:tcW w:type="dxa" w:w="8640"/>
-            <w:shd w:fill="F8FAFC"/>
-          </w:tcPr>
-          <w:p>
-            <w:r>
-              <w:br/>
-            </w:r>
-          </w:p>
-        </w:tc>
-      </w:tr>
-    </w:tbl>
-    <w:p/>
-    <w:p>
-      <w:r>
-        <w:rPr>
-          <w:b/>
-        </w:rPr>
-        <w:t xml:space="preserve">Q13. </w:t>
-      </w:r>
-      <w:r>
-        <w:t>¿Cuál es el precio máximo que estás dispuesto a pagar por el alquiler de una camper PREMIUM durante una semana (6 noches)?</w:t>
-      </w:r>
-    </w:p>
-    <w:p>
-      <w:r>
-        <w:rPr>
-          <w:i/>
-          <w:color w:val="64748B"/>
-        </w:rPr>
-        <w:t>(Max price per week — 6 nights — Premium.)</w:t>
-      </w:r>
-    </w:p>
-    <w:tbl>
-      <w:tblPr>
-        <w:tblW w:type="auto" w:w="0"/>
-        <w:tblLayout w:type="autofit"/>
-        <w:tblLook w:firstColumn="1" w:firstRow="1" w:lastColumn="0" w:lastRow="0" w:noHBand="0" w:noVBand="1" w:val="04A0"/>
-      </w:tblPr>
-      <w:tblGrid>
-        <w:gridCol w:w="8640"/>
-      </w:tblGrid>
-      <w:tr>
-        <w:tc>
-          <w:tcPr>
-            <w:tcW w:type="dxa" w:w="8640"/>
-            <w:shd w:fill="F8FAFC"/>
-          </w:tcPr>
-          <w:p>
-            <w:r>
-              <w:br/>
-            </w:r>
-          </w:p>
-        </w:tc>
-      </w:tr>
-    </w:tbl>
-    <w:p/>
-    <w:p>
-      <w:r>
-        <w:br w:type="page"/>
-      </w:r>
-    </w:p>
-    <w:p>
-      <w:pPr>
-        <w:pStyle w:val="Heading1"/>
-      </w:pPr>
-      <w:r>
-        <w:rPr>
-          <w:color w:val="0F172A"/>
-        </w:rPr>
-        <w:t>7. Preguntas del caso · Formal deliverable questions</w:t>
-      </w:r>
-    </w:p>
-    <w:p>
-      <w:r>
-        <w:rPr>
-          <w:b w:val="0"/>
-          <w:i/>
-          <w:sz w:val="22"/>
-        </w:rPr>
-        <w:t>The three questions below reproduce the original Nomade v2.0 deliverables. Each one is expanded with concrete simulator tasks so you can ground your answer in evidence from the interactive tool.</w:t>
+        <w:t>These three questions reproduce the original Nomade v2.0 deliverables. Write your answer either (a) inside the simulator's Case answers tab — everything will be exported to the Excel download — or (b) directly in the boxes below.</w:t>
       </w:r>
     </w:p>
     <w:p>
@@ -1349,22 +781,13 @@
           <w:b/>
           <w:color w:val="F97316"/>
         </w:rPr>
-        <w:t xml:space="preserve">P1. </w:t>
+        <w:t xml:space="preserve">P1 — </w:t>
       </w:r>
       <w:r>
         <w:rPr>
           <w:b/>
         </w:rPr>
-        <w:t>Indicar las suposiciones sobre las estructuras de costes de los competidores y la diferenciación del valor de marca en comparación con NOMADE. Tenga en cuenta que NOMADE es nuevo y que los demás están bien establecidos.</w:t>
-      </w:r>
-    </w:p>
-    <w:p>
-      <w:r>
-        <w:rPr>
-          <w:i/>
-          <w:color w:val="64748B"/>
-        </w:rPr>
-        <w:t>(State your assumptions about the competitors' cost structures and the differentiation of Nomade's brand value versus the established rivals.)</w:t>
+        <w:t>With the indicated data, give assumptions of competitors' cost structures and brand-value differentiation compared to NOMADE. Consider that NOMADE is new, and the others are well-established.</w:t>
       </w:r>
     </w:p>
     <w:p>
@@ -1374,7 +797,7 @@
           <w:i w:val="0"/>
           <w:sz w:val="22"/>
         </w:rPr>
-        <w:t>Tareas con el simulador · Tasks with the simulator:</w:t>
+        <w:t>Simulator tasks:</w:t>
       </w:r>
     </w:p>
     <w:p>
@@ -1382,7 +805,7 @@
         <w:pStyle w:val="ListBullet"/>
       </w:pPr>
       <w:r>
-        <w:t>In Competition-based → Profit curve, read the profit we would earn at each competitor's price (dashed lines). Fill the table below.</w:t>
+        <w:t>Read profit at each competitor's price on the Profit curve (dashed lines). Fill the table.</w:t>
       </w:r>
     </w:p>
     <w:tbl>
@@ -1446,7 +869,7 @@
               <w:rPr>
                 <w:b/>
               </w:rPr>
-              <w:t>Likely their FC (assumption)</w:t>
+              <w:t>Likely FC assumption</w:t>
             </w:r>
           </w:p>
         </w:tc>
@@ -1548,21 +971,22 @@
         <w:pStyle w:val="ListBullet"/>
       </w:pPr>
       <w:r>
-        <w:t>Justify why NOMADE's FC could be higher (new, smaller scale, fewer vehicles to amortise fixed costs) and what brand-value elements (design, sustainability, customisation) could compensate.</w:t>
+        <w:t>Justify NOMADE's cost disadvantage (new, smaller scale) and brand-value upside (design, sustainability, customisation).</w:t>
       </w:r>
     </w:p>
     <w:p>
-      <w:pPr>
-        <w:pStyle w:val="ListBullet"/>
-      </w:pPr>
       <w:r>
-        <w:t>Conclude with one-line assumptions per competitor (cost structure + brand-value gap).</w:t>
+        <w:rPr>
+          <w:b/>
+          <w:i w:val="0"/>
+          <w:sz w:val="22"/>
+        </w:rPr>
+        <w:t>Your answer:</w:t>
       </w:r>
     </w:p>
     <w:tbl>
       <w:tblPr>
         <w:tblW w:type="auto" w:w="0"/>
-        <w:tblLayout w:type="autofit"/>
         <w:tblLook w:firstColumn="1" w:firstRow="1" w:lastColumn="0" w:lastRow="0" w:noHBand="0" w:noVBand="1" w:val="04A0"/>
       </w:tblPr>
       <w:tblGrid>
@@ -1597,22 +1021,13 @@
           <w:b/>
           <w:color w:val="F97316"/>
         </w:rPr>
-        <w:t xml:space="preserve">P2. </w:t>
+        <w:t xml:space="preserve">P2 — </w:t>
       </w:r>
       <w:r>
         <w:rPr>
           <w:b/>
         </w:rPr>
-        <w:t>Sugerir una estrategia competitiva para Nomade, indicando si es posible mejorar su posición en el mercado con una visión estratégica, y considerar también algunos posibles factores psicológicos.</w:t>
-      </w:r>
-    </w:p>
-    <w:p>
-      <w:r>
-        <w:rPr>
-          <w:i/>
-          <w:color w:val="64748B"/>
-        </w:rPr>
-        <w:t>(Recommend a competitive strategy — strategic positioning + psychological factors.)</w:t>
+        <w:t>Suggest a competitive strategy for Nomade, indicating whether Nomade can improve its market position with a strategic view. Also consider possible psychological factors.</w:t>
       </w:r>
     </w:p>
     <w:p>
@@ -1622,7 +1037,7 @@
           <w:i w:val="0"/>
           <w:sz w:val="22"/>
         </w:rPr>
-        <w:t>Tareas con el simulador · Tasks with the simulator:</w:t>
+        <w:t>Simulator tasks:</w:t>
       </w:r>
     </w:p>
     <w:p>
@@ -1630,7 +1045,7 @@
         <w:pStyle w:val="ListBullet"/>
       </w:pPr>
       <w:r>
-        <w:t>Use the Profit curve drag-handle to propose a Standard price that beats our current peak while remaining below People Camper. Screenshot it.</w:t>
+        <w:t>Drag the green line and use Match-competitor / Snap-to-peak. Take a screenshot.</w:t>
       </w:r>
     </w:p>
     <w:p>
@@ -1638,7 +1053,7 @@
         <w:pStyle w:val="ListBullet"/>
       </w:pPr>
       <w:r>
-        <w:t>Open Psychological factors. Reset all controls from position. Experiment in this order:</w:t>
+        <w:t>On Psychological factors, experiment in this order:</w:t>
       </w:r>
     </w:p>
     <w:p>
@@ -1646,7 +1061,7 @@
         <w:pStyle w:val="ListNumber"/>
       </w:pPr>
       <w:r>
-        <w:t>Anchoring: design a Good-Better-Best sandwich. What middle price do you recommend? Apply it to Our Standard.</w:t>
+        <w:t>Anchoring: design a Good-Better-Best sandwich. Apply the middle to Our Standard.</w:t>
       </w:r>
     </w:p>
     <w:p>
@@ -1662,7 +1077,7 @@
         <w:pStyle w:val="ListNumber"/>
       </w:pPr>
       <w:r>
-        <w:t>Prospect Theory: if you raise price by €10 next year, quantify the perceived pain. Draft a one-sentence framing to reduce it.</w:t>
+        <w:t>Prospect Theory: if you raise price by €10 next year, quantify the pain and draft one sentence to reframe it.</w:t>
       </w:r>
     </w:p>
     <w:p>
@@ -1670,7 +1085,7 @@
         <w:pStyle w:val="ListNumber"/>
       </w:pPr>
       <w:r>
-        <w:t>Reference price: set the cheapest competitor as reference. What share of respondents sit above? Does this support or weaken your Standard price?</w:t>
+        <w:t>Reference price: cheapest competitor as reference. What share of respondents sit above?</w:t>
       </w:r>
     </w:p>
     <w:p>
@@ -1678,13 +1093,22 @@
         <w:pStyle w:val="ListBullet"/>
       </w:pPr>
       <w:r>
-        <w:t>Finish with a &lt;100-word positioning statement: where does Nomade sit, why, and what is the psychological hook.</w:t>
+        <w:t>Close with a &lt;100-word positioning statement.</w:t>
+      </w:r>
+    </w:p>
+    <w:p>
+      <w:r>
+        <w:rPr>
+          <w:b/>
+          <w:i w:val="0"/>
+          <w:sz w:val="22"/>
+        </w:rPr>
+        <w:t>Your answer:</w:t>
       </w:r>
     </w:p>
     <w:tbl>
       <w:tblPr>
         <w:tblW w:type="auto" w:w="0"/>
-        <w:tblLayout w:type="autofit"/>
         <w:tblLook w:firstColumn="1" w:firstRow="1" w:lastColumn="0" w:lastRow="0" w:noHBand="0" w:noVBand="1" w:val="04A0"/>
       </w:tblPr>
       <w:tblGrid>
@@ -1723,22 +1147,13 @@
           <w:b/>
           <w:color w:val="F97316"/>
         </w:rPr>
-        <w:t xml:space="preserve">P3. </w:t>
+        <w:t xml:space="preserve">P3 — </w:t>
       </w:r>
       <w:r>
         <w:rPr>
           <w:b/>
         </w:rPr>
-        <w:t>Sugerir una estrategia de implementación de precios con los precios de lista finales y elaborar algunas posibles acciones promocionales.</w:t>
-      </w:r>
-    </w:p>
-    <w:p>
-      <w:r>
-        <w:rPr>
-          <w:i/>
-          <w:color w:val="64748B"/>
-        </w:rPr>
-        <w:t>(Final list prices and promotional actions.)</w:t>
+        <w:t>Suggest a pricing implementation strategy with the final list prices and elaborate on possible promotional actions.</w:t>
       </w:r>
     </w:p>
     <w:p>
@@ -1748,7 +1163,7 @@
           <w:i w:val="0"/>
           <w:sz w:val="22"/>
         </w:rPr>
-        <w:t>Tareas con el simulador · Tasks with the simulator:</w:t>
+        <w:t>Simulator tasks:</w:t>
       </w:r>
     </w:p>
     <w:p>
@@ -1756,7 +1171,7 @@
         <w:pStyle w:val="ListBullet"/>
       </w:pPr>
       <w:r>
-        <w:t>For each combination (period × version) set the final price in Position &amp; prices. Fill the table:</w:t>
+        <w:t>Set final prices in Position &amp; prices for each combination:</w:t>
       </w:r>
     </w:p>
     <w:tbl>
@@ -1891,7 +1306,7 @@
         <w:pStyle w:val="ListBullet"/>
       </w:pPr>
       <w:r>
-        <w:t>Justify each number in one bullet, referring explicitly to: the peak, the WTP acceptance %, the nearest competitor and a psychological lever.</w:t>
+        <w:t>Justify each number (peak, WTP %, nearest competitor, psychological lever).</w:t>
       </w:r>
     </w:p>
     <w:p>
@@ -1899,7 +1314,7 @@
         <w:pStyle w:val="ListBullet"/>
       </w:pPr>
       <w:r>
-        <w:t>Draft 2–3 promotional actions compatible with your strategy (e.g., early-bird weekend, loyalty week-at-day-price, charm endings, good-better-best bundle). For each action, specify: target segment, price lever, expected pain / gain according to Prospect Theory.</w:t>
+        <w:t>Draft 2–3 promotions — target segment, price lever, expected pain/gain (Prospect Theory).</w:t>
       </w:r>
     </w:p>
     <w:p>
@@ -1907,13 +1322,22 @@
         <w:pStyle w:val="ListBullet"/>
       </w:pPr>
       <w:r>
-        <w:t>Add the analyst note inside the simulator, click Download Excel, and attach the file to your submission.</w:t>
+        <w:t>Add the analyst note in the simulator, click Download Excel, attach the file.</w:t>
+      </w:r>
+    </w:p>
+    <w:p>
+      <w:r>
+        <w:rPr>
+          <w:b/>
+          <w:i w:val="0"/>
+          <w:sz w:val="22"/>
+        </w:rPr>
+        <w:t>Your answer:</w:t>
       </w:r>
     </w:p>
     <w:tbl>
       <w:tblPr>
         <w:tblW w:type="auto" w:w="0"/>
-        <w:tblLayout w:type="autofit"/>
         <w:tblLook w:firstColumn="1" w:firstRow="1" w:lastColumn="0" w:lastRow="0" w:noHBand="0" w:noVBand="1" w:val="04A0"/>
       </w:tblPr>
       <w:tblGrid>
@@ -1959,7 +1383,7 @@
         <w:rPr>
           <w:color w:val="0F172A"/>
         </w:rPr>
-        <w:t>8. Criterios de evaluación · Evaluation criteria</w:t>
+        <w:t>7. Criterios de evaluación · Evaluation criteria</w:t>
       </w:r>
     </w:p>
     <w:p>
@@ -1967,7 +1391,7 @@
         <w:pStyle w:val="ListBullet"/>
       </w:pPr>
       <w:r>
-        <w:t>Rigor (simulator evidence: screenshots, Excel, numbers).</w:t>
+        <w:t>Rigour (simulator evidence: screenshots, Excel, numbers).</w:t>
       </w:r>
     </w:p>
     <w:p>
@@ -1975,7 +1399,7 @@
         <w:pStyle w:val="ListBullet"/>
       </w:pPr>
       <w:r>
-        <w:t>Integration of competition + WTP + psychological factors into a coherent story.</w:t>
+        <w:t>Integration of competition + WTP + psychological factors.</w:t>
       </w:r>
     </w:p>
     <w:p>
@@ -1991,7 +1415,7 @@
         <w:pStyle w:val="ListBullet"/>
       </w:pPr>
       <w:r>
-        <w:t>Attached Excel export with final prices, position snapshot and chart images.</w:t>
+        <w:t>Attached Excel export with final prices, position, Case answers and chart images.</w:t>
       </w:r>
     </w:p>
     <w:p>
@@ -2010,7 +1434,7 @@
         <w:pStyle w:val="ListNumber"/>
       </w:pPr>
       <w:r>
-        <w:t>This workbook (Word), every answer box filled in.</w:t>
+        <w:t>This workbook (Word), every answer box filled in — OR case answers written inside the simulator.</w:t>
       </w:r>
     </w:p>
     <w:p>
@@ -2018,7 +1442,7 @@
         <w:pStyle w:val="ListNumber"/>
       </w:pPr>
       <w:r>
-        <w:t>The Excel file (.xlsx) downloaded from the simulator with your final position.</w:t>
+        <w:t>The Excel (.xlsx) downloaded from the simulator — Guide, Questions, Answers (Day/Weekend/Week), Position, Case answers, Charts.</w:t>
       </w:r>
     </w:p>
     <w:p>
@@ -2026,7 +1450,177 @@
         <w:pStyle w:val="ListNumber"/>
       </w:pPr>
       <w:r>
-        <w:t>A one-page executive summary of your pricing recommendation.</w:t>
+        <w:t>A one-page executive summary.</w:t>
+      </w:r>
+    </w:p>
+    <w:p>
+      <w:r>
+        <w:br w:type="page"/>
+      </w:r>
+    </w:p>
+    <w:p>
+      <w:pPr>
+        <w:pStyle w:val="Heading1"/>
+      </w:pPr>
+      <w:r>
+        <w:rPr>
+          <w:color w:val="0F172A"/>
+        </w:rPr>
+        <w:t>Anexo · Appendix — The 13 survey questions (reference)</w:t>
+      </w:r>
+    </w:p>
+    <w:p>
+      <w:r>
+        <w:rPr>
+          <w:b w:val="0"/>
+          <w:i/>
+          <w:color w:val="64748B"/>
+          <w:sz w:val="22"/>
+        </w:rPr>
+        <w:t>These are the 13 items asked to the 95 survey respondents. They appear here for reference so that you can interpret the aggregated WTP distribution displayed by the simulator. You are NOT asked to answer them yourself.</w:t>
+      </w:r>
+    </w:p>
+    <w:p>
+      <w:r>
+        <w:rPr>
+          <w:b/>
+        </w:rPr>
+        <w:t xml:space="preserve">Q1. </w:t>
+      </w:r>
+      <w:r>
+        <w:t>Por favor, indique su género.</w:t>
+      </w:r>
+    </w:p>
+    <w:p>
+      <w:r>
+        <w:rPr>
+          <w:b/>
+        </w:rPr>
+        <w:t xml:space="preserve">Q2. </w:t>
+      </w:r>
+      <w:r>
+        <w:t>¿En qué rango de edad se encuentra?  &lt;20 / 20-30 / 30-40 / 40-50 / 50-60 / &gt;60</w:t>
+      </w:r>
+    </w:p>
+    <w:p>
+      <w:r>
+        <w:rPr>
+          <w:b/>
+        </w:rPr>
+        <w:t xml:space="preserve">Q3. </w:t>
+      </w:r>
+      <w:r>
+        <w:t>¿Cuál es su estado civil?  Soltero / Casado / Divorciado / Viudo</w:t>
+      </w:r>
+    </w:p>
+    <w:p>
+      <w:r>
+        <w:rPr>
+          <w:b/>
+        </w:rPr>
+        <w:t xml:space="preserve">Q4. </w:t>
+      </w:r>
+      <w:r>
+        <w:t>¿Cuál es su nivel de educación?  Primaria / Secundaria / Grado / Máster o Posgrado</w:t>
+      </w:r>
+    </w:p>
+    <w:p>
+      <w:r>
+        <w:rPr>
+          <w:b/>
+        </w:rPr>
+        <w:t xml:space="preserve">Q5. </w:t>
+      </w:r>
+      <w:r>
+        <w:t>Seleccione su situación laboral.  Empleado / Autónomo / Desempleado / Jubilado / Estudiante</w:t>
+      </w:r>
+    </w:p>
+    <w:p>
+      <w:r>
+        <w:rPr>
+          <w:b/>
+        </w:rPr>
+        <w:t xml:space="preserve">Q6. </w:t>
+      </w:r>
+      <w:r>
+        <w:t>¿Qué le gusta hacer en su tiempo libre? (Multi-select)  Viajar · Leer · Deporte · Aventura · Familia · Otras</w:t>
+      </w:r>
+    </w:p>
+    <w:p>
+      <w:r>
+        <w:rPr>
+          <w:b/>
+        </w:rPr>
+        <w:t xml:space="preserve">Q7. </w:t>
+      </w:r>
+      <w:r>
+        <w:t>¿Cuántos días sueles irte de vacaciones?  &lt;3 / 3-5 / 5-7 / &gt;7</w:t>
+      </w:r>
+    </w:p>
+    <w:p>
+      <w:r>
+        <w:rPr>
+          <w:b/>
+        </w:rPr>
+        <w:t xml:space="preserve">Q8. </w:t>
+      </w:r>
+      <w:r>
+        <w:t>Precio máximo dispuesto a pagar — camper ESTÁNDAR al día.</w:t>
+      </w:r>
+    </w:p>
+    <w:p>
+      <w:r>
+        <w:rPr>
+          <w:b/>
+        </w:rPr>
+        <w:t xml:space="preserve">Q9. </w:t>
+      </w:r>
+      <w:r>
+        <w:t>Precio máximo dispuesto a pagar — camper ESTÁNDAR fin de semana (2 noches).</w:t>
+      </w:r>
+    </w:p>
+    <w:p>
+      <w:r>
+        <w:rPr>
+          <w:b/>
+        </w:rPr>
+        <w:t xml:space="preserve">Q10. </w:t>
+      </w:r>
+      <w:r>
+        <w:t>Precio máximo dispuesto a pagar — camper ESTÁNDAR semana (6 noches).</w:t>
+      </w:r>
+    </w:p>
+    <w:p>
+      <w:r>
+        <w:rPr>
+          <w:b/>
+        </w:rPr>
+        <w:t xml:space="preserve">Q11. </w:t>
+      </w:r>
+      <w:r>
+        <w:t>Precio máximo dispuesto a pagar — camper PREMIUM al día.</w:t>
+      </w:r>
+    </w:p>
+    <w:p>
+      <w:r>
+        <w:rPr>
+          <w:b/>
+        </w:rPr>
+        <w:t xml:space="preserve">Q12. </w:t>
+      </w:r>
+      <w:r>
+        <w:t>Precio máximo dispuesto a pagar — camper PREMIUM fin de semana (2 noches).</w:t>
+      </w:r>
+    </w:p>
+    <w:p>
+      <w:r>
+        <w:rPr>
+          <w:b/>
+        </w:rPr>
+        <w:t xml:space="preserve">Q13. </w:t>
+      </w:r>
+      <w:r>
+        <w:t>Precio máximo dispuesto a pagar — camper PREMIUM semana (6 noches).</w:t>
       </w:r>
     </w:p>
     <w:sectPr>

</xml_diff>